<commit_message>
Updated SRS and SDD
</commit_message>
<xml_diff>
--- a/HMS_SRS_v1.0.docx
+++ b/HMS_SRS_v1.0.docx
@@ -65,7 +65,7 @@
           <w:sz w:val="24"/>
           <w:szCs w:val="24"/>
         </w:rPr>
-        <w:t xml:space="preserve">Version 1.0</w:t>
+        <w:t xml:space="preserve">Version 1.1</w:t>
       </w:r>
     </w:p>
     <w:p>
@@ -1413,7 +1413,7 @@
           <w:sz w:val="22"/>
           <w:szCs w:val="22"/>
         </w:rPr>
-        <w:t xml:space="preserve">Visitor entry and exit logging for security</w:t>
+        <w:t xml:space="preserve">Mess management with menu publication, meal attendance, and mess fee tracking</w:t>
       </w:r>
     </w:p>
     <w:p>
@@ -1432,7 +1432,45 @@
           <w:sz w:val="22"/>
           <w:szCs w:val="22"/>
         </w:rPr>
+        <w:t xml:space="preserve">Visitor entry and exit logging for security</w:t>
+      </w:r>
+    </w:p>
+    <w:p>
+      <w:pPr>
+        <w:pStyle w:val="ListParagraph"/>
+        <w:numPr>
+          <w:ilvl w:val="0"/>
+          <w:numId w:val="2"/>
+        </w:numPr>
+        <w:spacing w:after="60" w:before="60"/>
+      </w:pPr>
+      <w:r>
+        <w:rPr>
+          <w:rFonts w:ascii="Arial" w:cs="Arial" w:eastAsia="Arial" w:hAnsi="Arial"/>
+          <w:color w:val="2C2C2C"/>
+          <w:sz w:val="22"/>
+          <w:szCs w:val="22"/>
+        </w:rPr>
         <w:t xml:space="preserve">Admin dashboard with occupancy, payment, and complaint analytics</w:t>
+      </w:r>
+    </w:p>
+    <w:p>
+      <w:pPr>
+        <w:pStyle w:val="ListParagraph"/>
+        <w:numPr>
+          <w:ilvl w:val="0"/>
+          <w:numId w:val="2"/>
+        </w:numPr>
+        <w:spacing w:after="60" w:before="60"/>
+      </w:pPr>
+      <w:r>
+        <w:rPr>
+          <w:rFonts w:ascii="Arial" w:cs="Arial" w:eastAsia="Arial" w:hAnsi="Arial"/>
+          <w:color w:val="2C2C2C"/>
+          <w:sz w:val="22"/>
+          <w:szCs w:val="22"/>
+        </w:rPr>
+        <w:t xml:space="preserve">Hostel-wide announcements and notice board with targeted audience delivery</w:t>
       </w:r>
     </w:p>
     <w:p>
@@ -5739,7 +5777,7 @@
           <w:sz w:val="26"/>
           <w:szCs w:val="26"/>
         </w:rPr>
-        <w:t xml:space="preserve">3.5 Complaint Management System</w:t>
+        <w:t xml:space="preserve">3.5 Mess Management</w:t>
       </w:r>
     </w:p>
     <w:p>
@@ -5753,7 +5791,7 @@
           <w:sz w:val="22"/>
           <w:szCs w:val="22"/>
         </w:rPr>
-        <w:t xml:space="preserve">The system must enable residents to raise issues and track their resolution.</w:t>
+        <w:t xml:space="preserve">The system must support digital management of mess (dining) operations, including menu publication, fee tracking, and meal attendance, as a module distinct from general hostel fees.</w:t>
       </w:r>
     </w:p>
     <w:p>
@@ -5937,7 +5975,7 @@
                 <w:sz w:val="20"/>
                 <w:szCs w:val="20"/>
               </w:rPr>
-              <w:t xml:space="preserve">FR-25</w:t>
+              <w:t xml:space="preserve">FR-42</w:t>
             </w:r>
           </w:p>
         </w:tc>
@@ -5966,7 +6004,7 @@
                 <w:sz w:val="20"/>
                 <w:szCs w:val="20"/>
               </w:rPr>
-              <w:t xml:space="preserve">Submit Complaint</w:t>
+              <w:t xml:space="preserve">Weekly Mess Menu Management</w:t>
             </w:r>
           </w:p>
         </w:tc>
@@ -5995,7 +6033,7 @@
                 <w:sz w:val="20"/>
                 <w:szCs w:val="20"/>
               </w:rPr>
-              <w:t xml:space="preserve">Students shall be able to submit complaints by selecting a category (maintenance, cleanliness, security, noise, other), writing a description, and optionally uploading a photo.</w:t>
+              <w:t xml:space="preserve">Administrators shall be able to define and publish a weekly mess menu specifying meals (breakfast, lunch, dinner) for each day, viewable by all students.</w:t>
             </w:r>
           </w:p>
         </w:tc>
@@ -6024,7 +6062,7 @@
                 <w:sz w:val="20"/>
                 <w:szCs w:val="20"/>
               </w:rPr>
-              <w:t xml:space="preserve">High</w:t>
+              <w:t xml:space="preserve">Medium</w:t>
             </w:r>
           </w:p>
         </w:tc>
@@ -6055,7 +6093,7 @@
                 <w:sz w:val="20"/>
                 <w:szCs w:val="20"/>
               </w:rPr>
-              <w:t xml:space="preserve">FR-26</w:t>
+              <w:t xml:space="preserve">FR-43</w:t>
             </w:r>
           </w:p>
         </w:tc>
@@ -6084,7 +6122,7 @@
                 <w:sz w:val="20"/>
                 <w:szCs w:val="20"/>
               </w:rPr>
-              <w:t xml:space="preserve">Complaint Tracking</w:t>
+              <w:t xml:space="preserve">Meal Attendance Marking</w:t>
             </w:r>
           </w:p>
         </w:tc>
@@ -6113,7 +6151,7 @@
                 <w:sz w:val="20"/>
                 <w:szCs w:val="20"/>
               </w:rPr>
-              <w:t xml:space="preserve">Each complaint shall be assigned a unique ID. Students shall be able to view the current status of their complaints: Submitted, In Review, In Progress, Resolved, Closed.</w:t>
+              <w:t xml:space="preserve">Students shall be able to mark their attendance for upcoming meals through the student portal to help the mess staff plan food quantities.</w:t>
             </w:r>
           </w:p>
         </w:tc>
@@ -6142,7 +6180,7 @@
                 <w:sz w:val="20"/>
                 <w:szCs w:val="20"/>
               </w:rPr>
-              <w:t xml:space="preserve">High</w:t>
+              <w:t xml:space="preserve">Medium</w:t>
             </w:r>
           </w:p>
         </w:tc>
@@ -6173,7 +6211,7 @@
                 <w:sz w:val="20"/>
                 <w:szCs w:val="20"/>
               </w:rPr>
-              <w:t xml:space="preserve">FR-27</w:t>
+              <w:t xml:space="preserve">FR-44</w:t>
             </w:r>
           </w:p>
         </w:tc>
@@ -6202,7 +6240,7 @@
                 <w:sz w:val="20"/>
                 <w:szCs w:val="20"/>
               </w:rPr>
-              <w:t xml:space="preserve">Complaint Assignment</w:t>
+              <w:t xml:space="preserve">Mess Fee Structure</w:t>
             </w:r>
           </w:p>
         </w:tc>
@@ -6231,7 +6269,7 @@
                 <w:sz w:val="20"/>
                 <w:szCs w:val="20"/>
               </w:rPr>
-              <w:t xml:space="preserve">Administrators/Wardens shall be able to assign complaints to specific staff members for resolution.</w:t>
+              <w:t xml:space="preserve">Administrators shall be able to define mess fee structures separately from hostel fees, on a monthly or semester basis.</w:t>
             </w:r>
           </w:p>
         </w:tc>
@@ -6260,7 +6298,7 @@
                 <w:sz w:val="20"/>
                 <w:szCs w:val="20"/>
               </w:rPr>
-              <w:t xml:space="preserve">Medium</w:t>
+              <w:t xml:space="preserve">High</w:t>
             </w:r>
           </w:p>
         </w:tc>
@@ -6291,7 +6329,7 @@
                 <w:sz w:val="20"/>
                 <w:szCs w:val="20"/>
               </w:rPr>
-              <w:t xml:space="preserve">FR-28</w:t>
+              <w:t xml:space="preserve">FR-45</w:t>
             </w:r>
           </w:p>
         </w:tc>
@@ -6320,7 +6358,7 @@
                 <w:sz w:val="20"/>
                 <w:szCs w:val="20"/>
               </w:rPr>
-              <w:t xml:space="preserve">Status Updates</w:t>
+              <w:t xml:space="preserve">Mess Fee Tracking</w:t>
             </w:r>
           </w:p>
         </w:tc>
@@ -6349,7 +6387,7 @@
                 <w:sz w:val="20"/>
                 <w:szCs w:val="20"/>
               </w:rPr>
-              <w:t xml:space="preserve">Staff shall be able to update the status and add resolution notes to complaints. Students shall be notified via email on status changes.</w:t>
+              <w:t xml:space="preserve">The system shall track mess fee payment status per student, separately from hostel fee status, and display it on both admin and student dashboards.</w:t>
             </w:r>
           </w:p>
         </w:tc>
@@ -6409,7 +6447,7 @@
                 <w:sz w:val="20"/>
                 <w:szCs w:val="20"/>
               </w:rPr>
-              <w:t xml:space="preserve">FR-29</w:t>
+              <w:t xml:space="preserve">FR-46</w:t>
             </w:r>
           </w:p>
         </w:tc>
@@ -6438,7 +6476,7 @@
                 <w:sz w:val="20"/>
                 <w:szCs w:val="20"/>
               </w:rPr>
-              <w:t xml:space="preserve">Complaint Dashboard</w:t>
+              <w:t xml:space="preserve">Mess Feedback</w:t>
             </w:r>
           </w:p>
         </w:tc>
@@ -6467,7 +6505,7 @@
                 <w:sz w:val="20"/>
                 <w:szCs w:val="20"/>
               </w:rPr>
-              <w:t xml:space="preserve">Administrators shall see a complaint dashboard showing total open/resolved complaints, average resolution time, and complaint categories.</w:t>
+              <w:t xml:space="preserve">Students shall be able to submit feedback or ratings on meals, viewable by administrators for quality monitoring.</w:t>
             </w:r>
           </w:p>
         </w:tc>
@@ -6496,7 +6534,7 @@
                 <w:sz w:val="20"/>
                 <w:szCs w:val="20"/>
               </w:rPr>
-              <w:t xml:space="preserve">Medium</w:t>
+              <w:t xml:space="preserve">Low</w:t>
             </w:r>
           </w:p>
         </w:tc>
@@ -6527,7 +6565,7 @@
                 <w:sz w:val="20"/>
                 <w:szCs w:val="20"/>
               </w:rPr>
-              <w:t xml:space="preserve">FR-30</w:t>
+              <w:t xml:space="preserve">FR-47</w:t>
             </w:r>
           </w:p>
         </w:tc>
@@ -6556,7 +6594,7 @@
                 <w:sz w:val="20"/>
                 <w:szCs w:val="20"/>
               </w:rPr>
-              <w:t xml:space="preserve">Complaint History</w:t>
+              <w:t xml:space="preserve">Attendance-Based Reporting</w:t>
             </w:r>
           </w:p>
         </w:tc>
@@ -6585,7 +6623,7 @@
                 <w:sz w:val="20"/>
                 <w:szCs w:val="20"/>
               </w:rPr>
-              <w:t xml:space="preserve">All resolved and closed complaints shall be archived and searchable by date, category, and student.</w:t>
+              <w:t xml:space="preserve">The system shall generate a daily/weekly meal attendance summary to help reduce food wastage and support catering decisions.</w:t>
             </w:r>
           </w:p>
         </w:tc>
@@ -6642,7 +6680,7 @@
           <w:sz w:val="26"/>
           <w:szCs w:val="26"/>
         </w:rPr>
-        <w:t xml:space="preserve">3.6 Visitor Log System</w:t>
+        <w:t xml:space="preserve">3.6 Complaint Management System</w:t>
       </w:r>
     </w:p>
     <w:p>
@@ -6656,7 +6694,7 @@
           <w:sz w:val="22"/>
           <w:szCs w:val="22"/>
         </w:rPr>
-        <w:t xml:space="preserve">The system must maintain a secure log of all visitors entering and exiting the hostel.</w:t>
+        <w:t xml:space="preserve">The system must enable residents to raise issues and track their resolution.</w:t>
       </w:r>
     </w:p>
     <w:p>
@@ -6840,7 +6878,7 @@
                 <w:sz w:val="20"/>
                 <w:szCs w:val="20"/>
               </w:rPr>
-              <w:t xml:space="preserve">FR-31</w:t>
+              <w:t xml:space="preserve">FR-25</w:t>
             </w:r>
           </w:p>
         </w:tc>
@@ -6869,7 +6907,7 @@
                 <w:sz w:val="20"/>
                 <w:szCs w:val="20"/>
               </w:rPr>
-              <w:t xml:space="preserve">Visitor Entry Log</w:t>
+              <w:t xml:space="preserve">Submit Complaint</w:t>
             </w:r>
           </w:p>
         </w:tc>
@@ -6898,7 +6936,7 @@
                 <w:sz w:val="20"/>
                 <w:szCs w:val="20"/>
               </w:rPr>
-              <w:t xml:space="preserve">Wardens/Staff shall record visitor entries with: visitor name, ID proof type and number, person being visited, purpose, and check-in time.</w:t>
+              <w:t xml:space="preserve">Students shall be able to submit complaints by selecting a category (maintenance, cleanliness, security, noise, other), writing a description, and optionally uploading a photo.</w:t>
             </w:r>
           </w:p>
         </w:tc>
@@ -6958,7 +6996,7 @@
                 <w:sz w:val="20"/>
                 <w:szCs w:val="20"/>
               </w:rPr>
-              <w:t xml:space="preserve">FR-32</w:t>
+              <w:t xml:space="preserve">FR-26</w:t>
             </w:r>
           </w:p>
         </w:tc>
@@ -6987,7 +7025,7 @@
                 <w:sz w:val="20"/>
                 <w:szCs w:val="20"/>
               </w:rPr>
-              <w:t xml:space="preserve">Visitor Exit Log</w:t>
+              <w:t xml:space="preserve">Complaint Tracking</w:t>
             </w:r>
           </w:p>
         </w:tc>
@@ -7016,7 +7054,7 @@
                 <w:sz w:val="20"/>
                 <w:szCs w:val="20"/>
               </w:rPr>
-              <w:t xml:space="preserve">Staff shall record the check-out time when a visitor leaves. Any visitor checked in for more than the allowed duration shall be flagged.</w:t>
+              <w:t xml:space="preserve">Each complaint shall be assigned a unique ID. Students shall be able to view the current status of their complaints: Submitted, In Review, In Progress, Resolved, Closed.</w:t>
             </w:r>
           </w:p>
         </w:tc>
@@ -7076,7 +7114,7 @@
                 <w:sz w:val="20"/>
                 <w:szCs w:val="20"/>
               </w:rPr>
-              <w:t xml:space="preserve">FR-33</w:t>
+              <w:t xml:space="preserve">FR-27</w:t>
             </w:r>
           </w:p>
         </w:tc>
@@ -7105,7 +7143,7 @@
                 <w:sz w:val="20"/>
                 <w:szCs w:val="20"/>
               </w:rPr>
-              <w:t xml:space="preserve">Active Visitor View</w:t>
+              <w:t xml:space="preserve">Complaint Assignment</w:t>
             </w:r>
           </w:p>
         </w:tc>
@@ -7134,7 +7172,7 @@
                 <w:sz w:val="20"/>
                 <w:szCs w:val="20"/>
               </w:rPr>
-              <w:t xml:space="preserve">Wardens shall be able to view a real-time list of all visitors currently inside the hostel.</w:t>
+              <w:t xml:space="preserve">Administrators/Wardens shall be able to assign complaints to specific staff members for resolution.</w:t>
             </w:r>
           </w:p>
         </w:tc>
@@ -7163,7 +7201,7 @@
                 <w:sz w:val="20"/>
                 <w:szCs w:val="20"/>
               </w:rPr>
-              <w:t xml:space="preserve">High</w:t>
+              <w:t xml:space="preserve">Medium</w:t>
             </w:r>
           </w:p>
         </w:tc>
@@ -7194,7 +7232,7 @@
                 <w:sz w:val="20"/>
                 <w:szCs w:val="20"/>
               </w:rPr>
-              <w:t xml:space="preserve">FR-34</w:t>
+              <w:t xml:space="preserve">FR-28</w:t>
             </w:r>
           </w:p>
         </w:tc>
@@ -7223,7 +7261,7 @@
                 <w:sz w:val="20"/>
                 <w:szCs w:val="20"/>
               </w:rPr>
-              <w:t xml:space="preserve">Visitor History</w:t>
+              <w:t xml:space="preserve">Status Updates</w:t>
             </w:r>
           </w:p>
         </w:tc>
@@ -7252,7 +7290,7 @@
                 <w:sz w:val="20"/>
                 <w:szCs w:val="20"/>
               </w:rPr>
-              <w:t xml:space="preserve">Administrators shall be able to search visitor logs by date, visitor name, student name, or block.</w:t>
+              <w:t xml:space="preserve">Staff shall be able to update the status and add resolution notes to complaints. Students shall be notified via email on status changes.</w:t>
             </w:r>
           </w:p>
         </w:tc>
@@ -7281,7 +7319,7 @@
                 <w:sz w:val="20"/>
                 <w:szCs w:val="20"/>
               </w:rPr>
-              <w:t xml:space="preserve">Medium</w:t>
+              <w:t xml:space="preserve">High</w:t>
             </w:r>
           </w:p>
         </w:tc>
@@ -7312,7 +7350,7 @@
                 <w:sz w:val="20"/>
                 <w:szCs w:val="20"/>
               </w:rPr>
-              <w:t xml:space="preserve">FR-35</w:t>
+              <w:t xml:space="preserve">FR-29</w:t>
             </w:r>
           </w:p>
         </w:tc>
@@ -7341,7 +7379,7 @@
                 <w:sz w:val="20"/>
                 <w:szCs w:val="20"/>
               </w:rPr>
-              <w:t xml:space="preserve">Overstay Alerts</w:t>
+              <w:t xml:space="preserve">Complaint Dashboard</w:t>
             </w:r>
           </w:p>
         </w:tc>
@@ -7370,7 +7408,7 @@
                 <w:sz w:val="20"/>
                 <w:szCs w:val="20"/>
               </w:rPr>
-              <w:t xml:space="preserve">The system shall generate an alert when a visitor has been inside for longer than the configured maximum allowed duration (default: 2 hours).</w:t>
+              <w:t xml:space="preserve">Administrators shall see a complaint dashboard showing total open/resolved complaints, average resolution time, and complaint categories.</w:t>
             </w:r>
           </w:p>
         </w:tc>
@@ -7400,6 +7438,124 @@
                 <w:szCs w:val="20"/>
               </w:rPr>
               <w:t xml:space="preserve">Medium</w:t>
+            </w:r>
+          </w:p>
+        </w:tc>
+      </w:tr>
+      <w:tr>
+        <w:tc>
+          <w:tcPr>
+            <w:tcW w:type="dxa" w:w="600"/>
+            <w:tcBorders>
+              <w:top w:val="single" w:color="CCCCCC" w:sz="1"/>
+              <w:left w:val="single" w:color="CCCCCC" w:sz="1"/>
+              <w:bottom w:val="single" w:color="CCCCCC" w:sz="1"/>
+              <w:right w:val="single" w:color="CCCCCC" w:sz="1"/>
+            </w:tcBorders>
+            <w:shd w:fill="F2F2F2" w:val="clear"/>
+            <w:tcMar>
+              <w:top w:type="dxa" w:w="80"/>
+              <w:left w:type="dxa" w:w="120"/>
+              <w:bottom w:type="dxa" w:w="80"/>
+              <w:right w:type="dxa" w:w="120"/>
+            </w:tcMar>
+          </w:tcPr>
+          <w:p>
+            <w:r>
+              <w:rPr>
+                <w:rFonts w:ascii="Arial" w:cs="Arial" w:eastAsia="Arial" w:hAnsi="Arial"/>
+                <w:color w:val="2C2C2C"/>
+                <w:sz w:val="20"/>
+                <w:szCs w:val="20"/>
+              </w:rPr>
+              <w:t xml:space="preserve">FR-30</w:t>
+            </w:r>
+          </w:p>
+        </w:tc>
+        <w:tc>
+          <w:tcPr>
+            <w:tcW w:type="dxa" w:w="2400"/>
+            <w:tcBorders>
+              <w:top w:val="single" w:color="CCCCCC" w:sz="1"/>
+              <w:left w:val="single" w:color="CCCCCC" w:sz="1"/>
+              <w:bottom w:val="single" w:color="CCCCCC" w:sz="1"/>
+              <w:right w:val="single" w:color="CCCCCC" w:sz="1"/>
+            </w:tcBorders>
+            <w:shd w:fill="F2F2F2" w:val="clear"/>
+            <w:tcMar>
+              <w:top w:type="dxa" w:w="80"/>
+              <w:left w:type="dxa" w:w="120"/>
+              <w:bottom w:type="dxa" w:w="80"/>
+              <w:right w:type="dxa" w:w="120"/>
+            </w:tcMar>
+          </w:tcPr>
+          <w:p>
+            <w:r>
+              <w:rPr>
+                <w:rFonts w:ascii="Arial" w:cs="Arial" w:eastAsia="Arial" w:hAnsi="Arial"/>
+                <w:color w:val="2C2C2C"/>
+                <w:sz w:val="20"/>
+                <w:szCs w:val="20"/>
+              </w:rPr>
+              <w:t xml:space="preserve">Complaint History</w:t>
+            </w:r>
+          </w:p>
+        </w:tc>
+        <w:tc>
+          <w:tcPr>
+            <w:tcW w:type="dxa" w:w="4760"/>
+            <w:tcBorders>
+              <w:top w:val="single" w:color="CCCCCC" w:sz="1"/>
+              <w:left w:val="single" w:color="CCCCCC" w:sz="1"/>
+              <w:bottom w:val="single" w:color="CCCCCC" w:sz="1"/>
+              <w:right w:val="single" w:color="CCCCCC" w:sz="1"/>
+            </w:tcBorders>
+            <w:shd w:fill="F2F2F2" w:val="clear"/>
+            <w:tcMar>
+              <w:top w:type="dxa" w:w="80"/>
+              <w:left w:type="dxa" w:w="120"/>
+              <w:bottom w:type="dxa" w:w="80"/>
+              <w:right w:type="dxa" w:w="120"/>
+            </w:tcMar>
+          </w:tcPr>
+          <w:p>
+            <w:r>
+              <w:rPr>
+                <w:rFonts w:ascii="Arial" w:cs="Arial" w:eastAsia="Arial" w:hAnsi="Arial"/>
+                <w:color w:val="2C2C2C"/>
+                <w:sz w:val="20"/>
+                <w:szCs w:val="20"/>
+              </w:rPr>
+              <w:t xml:space="preserve">All resolved and closed complaints shall be archived and searchable by date, category, and student.</w:t>
+            </w:r>
+          </w:p>
+        </w:tc>
+        <w:tc>
+          <w:tcPr>
+            <w:tcW w:type="dxa" w:w="1600"/>
+            <w:tcBorders>
+              <w:top w:val="single" w:color="CCCCCC" w:sz="1"/>
+              <w:left w:val="single" w:color="CCCCCC" w:sz="1"/>
+              <w:bottom w:val="single" w:color="CCCCCC" w:sz="1"/>
+              <w:right w:val="single" w:color="CCCCCC" w:sz="1"/>
+            </w:tcBorders>
+            <w:shd w:fill="F2F2F2" w:val="clear"/>
+            <w:tcMar>
+              <w:top w:type="dxa" w:w="80"/>
+              <w:left w:type="dxa" w:w="120"/>
+              <w:bottom w:type="dxa" w:w="80"/>
+              <w:right w:type="dxa" w:w="120"/>
+            </w:tcMar>
+          </w:tcPr>
+          <w:p>
+            <w:r>
+              <w:rPr>
+                <w:rFonts w:ascii="Arial" w:cs="Arial" w:eastAsia="Arial" w:hAnsi="Arial"/>
+                <w:color w:val="2C2C2C"/>
+                <w:sz w:val="20"/>
+                <w:szCs w:val="20"/>
+              </w:rPr>
+              <w:t xml:space="preserve">Low</w:t>
             </w:r>
           </w:p>
         </w:tc>
@@ -7427,7 +7583,7 @@
           <w:sz w:val="26"/>
           <w:szCs w:val="26"/>
         </w:rPr>
-        <w:t xml:space="preserve">3.7 Admin Dashboard and Analytics</w:t>
+        <w:t xml:space="preserve">3.7 Visitor Log System</w:t>
       </w:r>
     </w:p>
     <w:p>
@@ -7441,7 +7597,7 @@
           <w:sz w:val="22"/>
           <w:szCs w:val="22"/>
         </w:rPr>
-        <w:t xml:space="preserve">The system must provide administrators with real-time insights and reports.</w:t>
+        <w:t xml:space="preserve">The system must maintain a secure log of all visitors entering and exiting the hostel.</w:t>
       </w:r>
     </w:p>
     <w:p>
@@ -7625,7 +7781,7 @@
                 <w:sz w:val="20"/>
                 <w:szCs w:val="20"/>
               </w:rPr>
-              <w:t xml:space="preserve">FR-36</w:t>
+              <w:t xml:space="preserve">FR-31</w:t>
             </w:r>
           </w:p>
         </w:tc>
@@ -7654,7 +7810,7 @@
                 <w:sz w:val="20"/>
                 <w:szCs w:val="20"/>
               </w:rPr>
-              <w:t xml:space="preserve">Occupancy Analytics</w:t>
+              <w:t xml:space="preserve">Visitor Entry Log</w:t>
             </w:r>
           </w:p>
         </w:tc>
@@ -7683,7 +7839,7 @@
                 <w:sz w:val="20"/>
                 <w:szCs w:val="20"/>
               </w:rPr>
-              <w:t xml:space="preserve">The dashboard shall display current occupancy rate, total beds, occupied beds, and available beds with visual charts.</w:t>
+              <w:t xml:space="preserve">Wardens/Staff shall record visitor entries with: visitor name, ID proof type and number, person being visited, purpose, and check-in time.</w:t>
             </w:r>
           </w:p>
         </w:tc>
@@ -7743,7 +7899,7 @@
                 <w:sz w:val="20"/>
                 <w:szCs w:val="20"/>
               </w:rPr>
-              <w:t xml:space="preserve">FR-37</w:t>
+              <w:t xml:space="preserve">FR-32</w:t>
             </w:r>
           </w:p>
         </w:tc>
@@ -7772,7 +7928,7 @@
                 <w:sz w:val="20"/>
                 <w:szCs w:val="20"/>
               </w:rPr>
-              <w:t xml:space="preserve">Payment Analytics</w:t>
+              <w:t xml:space="preserve">Visitor Exit Log</w:t>
             </w:r>
           </w:p>
         </w:tc>
@@ -7801,7 +7957,7 @@
                 <w:sz w:val="20"/>
                 <w:szCs w:val="20"/>
               </w:rPr>
-              <w:t xml:space="preserve">The dashboard shall display total revenue collected, outstanding dues, number of defaulters, and month-over-month collection trends.</w:t>
+              <w:t xml:space="preserve">Staff shall record the check-out time when a visitor leaves. Any visitor checked in for more than the allowed duration shall be flagged.</w:t>
             </w:r>
           </w:p>
         </w:tc>
@@ -7861,7 +8017,7 @@
                 <w:sz w:val="20"/>
                 <w:szCs w:val="20"/>
               </w:rPr>
-              <w:t xml:space="preserve">FR-38</w:t>
+              <w:t xml:space="preserve">FR-33</w:t>
             </w:r>
           </w:p>
         </w:tc>
@@ -7890,7 +8046,7 @@
                 <w:sz w:val="20"/>
                 <w:szCs w:val="20"/>
               </w:rPr>
-              <w:t xml:space="preserve">Complaint Analytics</w:t>
+              <w:t xml:space="preserve">Active Visitor View</w:t>
             </w:r>
           </w:p>
         </w:tc>
@@ -7919,7 +8075,7 @@
                 <w:sz w:val="20"/>
                 <w:szCs w:val="20"/>
               </w:rPr>
-              <w:t xml:space="preserve">The dashboard shall show complaint volume by category, average resolution time, and trend over the past 30/90 days.</w:t>
+              <w:t xml:space="preserve">Wardens shall be able to view a real-time list of all visitors currently inside the hostel.</w:t>
             </w:r>
           </w:p>
         </w:tc>
@@ -7948,7 +8104,7 @@
                 <w:sz w:val="20"/>
                 <w:szCs w:val="20"/>
               </w:rPr>
-              <w:t xml:space="preserve">Medium</w:t>
+              <w:t xml:space="preserve">High</w:t>
             </w:r>
           </w:p>
         </w:tc>
@@ -7979,7 +8135,7 @@
                 <w:sz w:val="20"/>
                 <w:szCs w:val="20"/>
               </w:rPr>
-              <w:t xml:space="preserve">FR-39</w:t>
+              <w:t xml:space="preserve">FR-34</w:t>
             </w:r>
           </w:p>
         </w:tc>
@@ -8008,7 +8164,7 @@
                 <w:sz w:val="20"/>
                 <w:szCs w:val="20"/>
               </w:rPr>
-              <w:t xml:space="preserve">Visitor Analytics</w:t>
+              <w:t xml:space="preserve">Visitor History</w:t>
             </w:r>
           </w:p>
         </w:tc>
@@ -8037,7 +8193,7 @@
                 <w:sz w:val="20"/>
                 <w:szCs w:val="20"/>
               </w:rPr>
-              <w:t xml:space="preserve">The dashboard shall display daily visitor count trends and peak hours.</w:t>
+              <w:t xml:space="preserve">Administrators shall be able to search visitor logs by date, visitor name, student name, or block.</w:t>
             </w:r>
           </w:p>
         </w:tc>
@@ -8066,7 +8222,7 @@
                 <w:sz w:val="20"/>
                 <w:szCs w:val="20"/>
               </w:rPr>
-              <w:t xml:space="preserve">Low</w:t>
+              <w:t xml:space="preserve">Medium</w:t>
             </w:r>
           </w:p>
         </w:tc>
@@ -8097,7 +8253,7 @@
                 <w:sz w:val="20"/>
                 <w:szCs w:val="20"/>
               </w:rPr>
-              <w:t xml:space="preserve">FR-40</w:t>
+              <w:t xml:space="preserve">FR-35</w:t>
             </w:r>
           </w:p>
         </w:tc>
@@ -8126,7 +8282,7 @@
                 <w:sz w:val="20"/>
                 <w:szCs w:val="20"/>
               </w:rPr>
-              <w:t xml:space="preserve">Exportable Reports</w:t>
+              <w:t xml:space="preserve">Overstay Alerts</w:t>
             </w:r>
           </w:p>
         </w:tc>
@@ -8155,7 +8311,7 @@
                 <w:sz w:val="20"/>
                 <w:szCs w:val="20"/>
               </w:rPr>
-              <w:t xml:space="preserve">Administrators shall be able to export any report as a CSV or PDF file.</w:t>
+              <w:t xml:space="preserve">The system shall generate an alert when a visitor has been inside for longer than the configured maximum allowed duration (default: 2 hours).</w:t>
             </w:r>
           </w:p>
         </w:tc>
@@ -8185,6 +8341,201 @@
                 <w:szCs w:val="20"/>
               </w:rPr>
               <w:t xml:space="preserve">Medium</w:t>
+            </w:r>
+          </w:p>
+        </w:tc>
+      </w:tr>
+    </w:tbl>
+    <w:p>
+      <w:pPr>
+        <w:spacing w:after="100" w:before="0"/>
+      </w:pPr>
+      <w:r>
+        <w:t xml:space="preserve"/>
+      </w:r>
+    </w:p>
+    <w:p>
+      <w:pPr>
+        <w:pStyle w:val="Heading2"/>
+        <w:spacing w:after="120" w:before="280"/>
+      </w:pPr>
+      <w:r>
+        <w:rPr>
+          <w:rFonts w:ascii="Arial" w:cs="Arial" w:eastAsia="Arial" w:hAnsi="Arial"/>
+          <w:b/>
+          <w:bCs/>
+          <w:color w:val="2E75B6"/>
+          <w:sz w:val="26"/>
+          <w:szCs w:val="26"/>
+        </w:rPr>
+        <w:t xml:space="preserve">3.8 Admin Dashboard and Analytics</w:t>
+      </w:r>
+    </w:p>
+    <w:p>
+      <w:pPr>
+        <w:spacing w:after="100" w:before="80"/>
+      </w:pPr>
+      <w:r>
+        <w:rPr>
+          <w:rFonts w:ascii="Arial" w:cs="Arial" w:eastAsia="Arial" w:hAnsi="Arial"/>
+          <w:color w:val="2C2C2C"/>
+          <w:sz w:val="22"/>
+          <w:szCs w:val="22"/>
+        </w:rPr>
+        <w:t xml:space="preserve">The system must provide administrators with real-time insights and reports.</w:t>
+      </w:r>
+    </w:p>
+    <w:p>
+      <w:pPr>
+        <w:spacing w:after="0" w:before="0"/>
+      </w:pPr>
+      <w:r>
+        <w:t xml:space="preserve"/>
+      </w:r>
+    </w:p>
+    <w:tbl>
+      <w:tblPr>
+        <w:tblW w:type="dxa" w:w="9360"/>
+        <w:tblBorders>
+          <w:top w:val="single" w:color="auto" w:sz="4"/>
+          <w:left w:val="single" w:color="auto" w:sz="4"/>
+          <w:bottom w:val="single" w:color="auto" w:sz="4"/>
+          <w:right w:val="single" w:color="auto" w:sz="4"/>
+          <w:insideH w:val="single" w:color="auto" w:sz="4"/>
+          <w:insideV w:val="single" w:color="auto" w:sz="4"/>
+        </w:tblBorders>
+      </w:tblPr>
+      <w:tblGrid>
+        <w:gridCol w:w="600"/>
+        <w:gridCol w:w="2400"/>
+        <w:gridCol w:w="4760"/>
+        <w:gridCol w:w="1600"/>
+      </w:tblGrid>
+      <w:tr>
+        <w:trPr>
+          <w:tblHeader/>
+        </w:trPr>
+        <w:tc>
+          <w:tcPr>
+            <w:tcW w:type="dxa" w:w="600"/>
+            <w:tcBorders>
+              <w:top w:val="single" w:color="CCCCCC" w:sz="1"/>
+              <w:left w:val="single" w:color="CCCCCC" w:sz="1"/>
+              <w:bottom w:val="single" w:color="CCCCCC" w:sz="1"/>
+              <w:right w:val="single" w:color="CCCCCC" w:sz="1"/>
+            </w:tcBorders>
+            <w:shd w:fill="1F4E79" w:val="clear"/>
+            <w:tcMar>
+              <w:top w:type="dxa" w:w="80"/>
+              <w:left w:type="dxa" w:w="120"/>
+              <w:bottom w:type="dxa" w:w="80"/>
+              <w:right w:type="dxa" w:w="120"/>
+            </w:tcMar>
+          </w:tcPr>
+          <w:p>
+            <w:r>
+              <w:rPr>
+                <w:rFonts w:ascii="Arial" w:cs="Arial" w:eastAsia="Arial" w:hAnsi="Arial"/>
+                <w:b/>
+                <w:bCs/>
+                <w:color w:val="FFFFFF"/>
+                <w:sz w:val="20"/>
+                <w:szCs w:val="20"/>
+              </w:rPr>
+              <w:t xml:space="preserve">REQ ID</w:t>
+            </w:r>
+          </w:p>
+        </w:tc>
+        <w:tc>
+          <w:tcPr>
+            <w:tcW w:type="dxa" w:w="2400"/>
+            <w:tcBorders>
+              <w:top w:val="single" w:color="CCCCCC" w:sz="1"/>
+              <w:left w:val="single" w:color="CCCCCC" w:sz="1"/>
+              <w:bottom w:val="single" w:color="CCCCCC" w:sz="1"/>
+              <w:right w:val="single" w:color="CCCCCC" w:sz="1"/>
+            </w:tcBorders>
+            <w:shd w:fill="1F4E79" w:val="clear"/>
+            <w:tcMar>
+              <w:top w:type="dxa" w:w="80"/>
+              <w:left w:type="dxa" w:w="120"/>
+              <w:bottom w:type="dxa" w:w="80"/>
+              <w:right w:type="dxa" w:w="120"/>
+            </w:tcMar>
+          </w:tcPr>
+          <w:p>
+            <w:r>
+              <w:rPr>
+                <w:rFonts w:ascii="Arial" w:cs="Arial" w:eastAsia="Arial" w:hAnsi="Arial"/>
+                <w:b/>
+                <w:bCs/>
+                <w:color w:val="FFFFFF"/>
+                <w:sz w:val="20"/>
+                <w:szCs w:val="20"/>
+              </w:rPr>
+              <w:t xml:space="preserve">Requirement Name</w:t>
+            </w:r>
+          </w:p>
+        </w:tc>
+        <w:tc>
+          <w:tcPr>
+            <w:tcW w:type="dxa" w:w="4760"/>
+            <w:tcBorders>
+              <w:top w:val="single" w:color="CCCCCC" w:sz="1"/>
+              <w:left w:val="single" w:color="CCCCCC" w:sz="1"/>
+              <w:bottom w:val="single" w:color="CCCCCC" w:sz="1"/>
+              <w:right w:val="single" w:color="CCCCCC" w:sz="1"/>
+            </w:tcBorders>
+            <w:shd w:fill="1F4E79" w:val="clear"/>
+            <w:tcMar>
+              <w:top w:type="dxa" w:w="80"/>
+              <w:left w:type="dxa" w:w="120"/>
+              <w:bottom w:type="dxa" w:w="80"/>
+              <w:right w:type="dxa" w:w="120"/>
+            </w:tcMar>
+          </w:tcPr>
+          <w:p>
+            <w:r>
+              <w:rPr>
+                <w:rFonts w:ascii="Arial" w:cs="Arial" w:eastAsia="Arial" w:hAnsi="Arial"/>
+                <w:b/>
+                <w:bCs/>
+                <w:color w:val="FFFFFF"/>
+                <w:sz w:val="20"/>
+                <w:szCs w:val="20"/>
+              </w:rPr>
+              <w:t xml:space="preserve">Description</w:t>
+            </w:r>
+          </w:p>
+        </w:tc>
+        <w:tc>
+          <w:tcPr>
+            <w:tcW w:type="dxa" w:w="1600"/>
+            <w:tcBorders>
+              <w:top w:val="single" w:color="CCCCCC" w:sz="1"/>
+              <w:left w:val="single" w:color="CCCCCC" w:sz="1"/>
+              <w:bottom w:val="single" w:color="CCCCCC" w:sz="1"/>
+              <w:right w:val="single" w:color="CCCCCC" w:sz="1"/>
+            </w:tcBorders>
+            <w:shd w:fill="1F4E79" w:val="clear"/>
+            <w:tcMar>
+              <w:top w:type="dxa" w:w="80"/>
+              <w:left w:type="dxa" w:w="120"/>
+              <w:bottom w:type="dxa" w:w="80"/>
+              <w:right w:type="dxa" w:w="120"/>
+            </w:tcMar>
+          </w:tcPr>
+          <w:p>
+            <w:r>
+              <w:rPr>
+                <w:rFonts w:ascii="Arial" w:cs="Arial" w:eastAsia="Arial" w:hAnsi="Arial"/>
+                <w:b/>
+                <w:bCs/>
+                <w:color w:val="FFFFFF"/>
+                <w:sz w:val="20"/>
+                <w:szCs w:val="20"/>
+              </w:rPr>
+              <w:t xml:space="preserve">Priority</w:t>
             </w:r>
           </w:p>
         </w:tc>
@@ -8199,6 +8550,124 @@
               <w:bottom w:val="single" w:color="CCCCCC" w:sz="1"/>
               <w:right w:val="single" w:color="CCCCCC" w:sz="1"/>
             </w:tcBorders>
+            <w:shd w:fill="FFFFFF" w:val="clear"/>
+            <w:tcMar>
+              <w:top w:type="dxa" w:w="80"/>
+              <w:left w:type="dxa" w:w="120"/>
+              <w:bottom w:type="dxa" w:w="80"/>
+              <w:right w:type="dxa" w:w="120"/>
+            </w:tcMar>
+          </w:tcPr>
+          <w:p>
+            <w:r>
+              <w:rPr>
+                <w:rFonts w:ascii="Arial" w:cs="Arial" w:eastAsia="Arial" w:hAnsi="Arial"/>
+                <w:color w:val="2C2C2C"/>
+                <w:sz w:val="20"/>
+                <w:szCs w:val="20"/>
+              </w:rPr>
+              <w:t xml:space="preserve">FR-36</w:t>
+            </w:r>
+          </w:p>
+        </w:tc>
+        <w:tc>
+          <w:tcPr>
+            <w:tcW w:type="dxa" w:w="2400"/>
+            <w:tcBorders>
+              <w:top w:val="single" w:color="CCCCCC" w:sz="1"/>
+              <w:left w:val="single" w:color="CCCCCC" w:sz="1"/>
+              <w:bottom w:val="single" w:color="CCCCCC" w:sz="1"/>
+              <w:right w:val="single" w:color="CCCCCC" w:sz="1"/>
+            </w:tcBorders>
+            <w:shd w:fill="FFFFFF" w:val="clear"/>
+            <w:tcMar>
+              <w:top w:type="dxa" w:w="80"/>
+              <w:left w:type="dxa" w:w="120"/>
+              <w:bottom w:type="dxa" w:w="80"/>
+              <w:right w:type="dxa" w:w="120"/>
+            </w:tcMar>
+          </w:tcPr>
+          <w:p>
+            <w:r>
+              <w:rPr>
+                <w:rFonts w:ascii="Arial" w:cs="Arial" w:eastAsia="Arial" w:hAnsi="Arial"/>
+                <w:color w:val="2C2C2C"/>
+                <w:sz w:val="20"/>
+                <w:szCs w:val="20"/>
+              </w:rPr>
+              <w:t xml:space="preserve">Occupancy Analytics</w:t>
+            </w:r>
+          </w:p>
+        </w:tc>
+        <w:tc>
+          <w:tcPr>
+            <w:tcW w:type="dxa" w:w="4760"/>
+            <w:tcBorders>
+              <w:top w:val="single" w:color="CCCCCC" w:sz="1"/>
+              <w:left w:val="single" w:color="CCCCCC" w:sz="1"/>
+              <w:bottom w:val="single" w:color="CCCCCC" w:sz="1"/>
+              <w:right w:val="single" w:color="CCCCCC" w:sz="1"/>
+            </w:tcBorders>
+            <w:shd w:fill="FFFFFF" w:val="clear"/>
+            <w:tcMar>
+              <w:top w:type="dxa" w:w="80"/>
+              <w:left w:type="dxa" w:w="120"/>
+              <w:bottom w:type="dxa" w:w="80"/>
+              <w:right w:type="dxa" w:w="120"/>
+            </w:tcMar>
+          </w:tcPr>
+          <w:p>
+            <w:r>
+              <w:rPr>
+                <w:rFonts w:ascii="Arial" w:cs="Arial" w:eastAsia="Arial" w:hAnsi="Arial"/>
+                <w:color w:val="2C2C2C"/>
+                <w:sz w:val="20"/>
+                <w:szCs w:val="20"/>
+              </w:rPr>
+              <w:t xml:space="preserve">The dashboard shall display current occupancy rate, total beds, occupied beds, and available beds with visual charts.</w:t>
+            </w:r>
+          </w:p>
+        </w:tc>
+        <w:tc>
+          <w:tcPr>
+            <w:tcW w:type="dxa" w:w="1600"/>
+            <w:tcBorders>
+              <w:top w:val="single" w:color="CCCCCC" w:sz="1"/>
+              <w:left w:val="single" w:color="CCCCCC" w:sz="1"/>
+              <w:bottom w:val="single" w:color="CCCCCC" w:sz="1"/>
+              <w:right w:val="single" w:color="CCCCCC" w:sz="1"/>
+            </w:tcBorders>
+            <w:shd w:fill="FFFFFF" w:val="clear"/>
+            <w:tcMar>
+              <w:top w:type="dxa" w:w="80"/>
+              <w:left w:type="dxa" w:w="120"/>
+              <w:bottom w:type="dxa" w:w="80"/>
+              <w:right w:type="dxa" w:w="120"/>
+            </w:tcMar>
+          </w:tcPr>
+          <w:p>
+            <w:r>
+              <w:rPr>
+                <w:rFonts w:ascii="Arial" w:cs="Arial" w:eastAsia="Arial" w:hAnsi="Arial"/>
+                <w:color w:val="2C2C2C"/>
+                <w:sz w:val="20"/>
+                <w:szCs w:val="20"/>
+              </w:rPr>
+              <w:t xml:space="preserve">High</w:t>
+            </w:r>
+          </w:p>
+        </w:tc>
+      </w:tr>
+      <w:tr>
+        <w:tc>
+          <w:tcPr>
+            <w:tcW w:type="dxa" w:w="600"/>
+            <w:tcBorders>
+              <w:top w:val="single" w:color="CCCCCC" w:sz="1"/>
+              <w:left w:val="single" w:color="CCCCCC" w:sz="1"/>
+              <w:bottom w:val="single" w:color="CCCCCC" w:sz="1"/>
+              <w:right w:val="single" w:color="CCCCCC" w:sz="1"/>
+            </w:tcBorders>
             <w:shd w:fill="F2F2F2" w:val="clear"/>
             <w:tcMar>
               <w:top w:type="dxa" w:w="80"/>
@@ -8215,6 +8684,478 @@
                 <w:sz w:val="20"/>
                 <w:szCs w:val="20"/>
               </w:rPr>
+              <w:t xml:space="preserve">FR-37</w:t>
+            </w:r>
+          </w:p>
+        </w:tc>
+        <w:tc>
+          <w:tcPr>
+            <w:tcW w:type="dxa" w:w="2400"/>
+            <w:tcBorders>
+              <w:top w:val="single" w:color="CCCCCC" w:sz="1"/>
+              <w:left w:val="single" w:color="CCCCCC" w:sz="1"/>
+              <w:bottom w:val="single" w:color="CCCCCC" w:sz="1"/>
+              <w:right w:val="single" w:color="CCCCCC" w:sz="1"/>
+            </w:tcBorders>
+            <w:shd w:fill="F2F2F2" w:val="clear"/>
+            <w:tcMar>
+              <w:top w:type="dxa" w:w="80"/>
+              <w:left w:type="dxa" w:w="120"/>
+              <w:bottom w:type="dxa" w:w="80"/>
+              <w:right w:type="dxa" w:w="120"/>
+            </w:tcMar>
+          </w:tcPr>
+          <w:p>
+            <w:r>
+              <w:rPr>
+                <w:rFonts w:ascii="Arial" w:cs="Arial" w:eastAsia="Arial" w:hAnsi="Arial"/>
+                <w:color w:val="2C2C2C"/>
+                <w:sz w:val="20"/>
+                <w:szCs w:val="20"/>
+              </w:rPr>
+              <w:t xml:space="preserve">Payment Analytics</w:t>
+            </w:r>
+          </w:p>
+        </w:tc>
+        <w:tc>
+          <w:tcPr>
+            <w:tcW w:type="dxa" w:w="4760"/>
+            <w:tcBorders>
+              <w:top w:val="single" w:color="CCCCCC" w:sz="1"/>
+              <w:left w:val="single" w:color="CCCCCC" w:sz="1"/>
+              <w:bottom w:val="single" w:color="CCCCCC" w:sz="1"/>
+              <w:right w:val="single" w:color="CCCCCC" w:sz="1"/>
+            </w:tcBorders>
+            <w:shd w:fill="F2F2F2" w:val="clear"/>
+            <w:tcMar>
+              <w:top w:type="dxa" w:w="80"/>
+              <w:left w:type="dxa" w:w="120"/>
+              <w:bottom w:type="dxa" w:w="80"/>
+              <w:right w:type="dxa" w:w="120"/>
+            </w:tcMar>
+          </w:tcPr>
+          <w:p>
+            <w:r>
+              <w:rPr>
+                <w:rFonts w:ascii="Arial" w:cs="Arial" w:eastAsia="Arial" w:hAnsi="Arial"/>
+                <w:color w:val="2C2C2C"/>
+                <w:sz w:val="20"/>
+                <w:szCs w:val="20"/>
+              </w:rPr>
+              <w:t xml:space="preserve">The dashboard shall display total revenue collected, outstanding dues, number of defaulters, and month-over-month collection trends.</w:t>
+            </w:r>
+          </w:p>
+        </w:tc>
+        <w:tc>
+          <w:tcPr>
+            <w:tcW w:type="dxa" w:w="1600"/>
+            <w:tcBorders>
+              <w:top w:val="single" w:color="CCCCCC" w:sz="1"/>
+              <w:left w:val="single" w:color="CCCCCC" w:sz="1"/>
+              <w:bottom w:val="single" w:color="CCCCCC" w:sz="1"/>
+              <w:right w:val="single" w:color="CCCCCC" w:sz="1"/>
+            </w:tcBorders>
+            <w:shd w:fill="F2F2F2" w:val="clear"/>
+            <w:tcMar>
+              <w:top w:type="dxa" w:w="80"/>
+              <w:left w:type="dxa" w:w="120"/>
+              <w:bottom w:type="dxa" w:w="80"/>
+              <w:right w:type="dxa" w:w="120"/>
+            </w:tcMar>
+          </w:tcPr>
+          <w:p>
+            <w:r>
+              <w:rPr>
+                <w:rFonts w:ascii="Arial" w:cs="Arial" w:eastAsia="Arial" w:hAnsi="Arial"/>
+                <w:color w:val="2C2C2C"/>
+                <w:sz w:val="20"/>
+                <w:szCs w:val="20"/>
+              </w:rPr>
+              <w:t xml:space="preserve">High</w:t>
+            </w:r>
+          </w:p>
+        </w:tc>
+      </w:tr>
+      <w:tr>
+        <w:tc>
+          <w:tcPr>
+            <w:tcW w:type="dxa" w:w="600"/>
+            <w:tcBorders>
+              <w:top w:val="single" w:color="CCCCCC" w:sz="1"/>
+              <w:left w:val="single" w:color="CCCCCC" w:sz="1"/>
+              <w:bottom w:val="single" w:color="CCCCCC" w:sz="1"/>
+              <w:right w:val="single" w:color="CCCCCC" w:sz="1"/>
+            </w:tcBorders>
+            <w:shd w:fill="FFFFFF" w:val="clear"/>
+            <w:tcMar>
+              <w:top w:type="dxa" w:w="80"/>
+              <w:left w:type="dxa" w:w="120"/>
+              <w:bottom w:type="dxa" w:w="80"/>
+              <w:right w:type="dxa" w:w="120"/>
+            </w:tcMar>
+          </w:tcPr>
+          <w:p>
+            <w:r>
+              <w:rPr>
+                <w:rFonts w:ascii="Arial" w:cs="Arial" w:eastAsia="Arial" w:hAnsi="Arial"/>
+                <w:color w:val="2C2C2C"/>
+                <w:sz w:val="20"/>
+                <w:szCs w:val="20"/>
+              </w:rPr>
+              <w:t xml:space="preserve">FR-38</w:t>
+            </w:r>
+          </w:p>
+        </w:tc>
+        <w:tc>
+          <w:tcPr>
+            <w:tcW w:type="dxa" w:w="2400"/>
+            <w:tcBorders>
+              <w:top w:val="single" w:color="CCCCCC" w:sz="1"/>
+              <w:left w:val="single" w:color="CCCCCC" w:sz="1"/>
+              <w:bottom w:val="single" w:color="CCCCCC" w:sz="1"/>
+              <w:right w:val="single" w:color="CCCCCC" w:sz="1"/>
+            </w:tcBorders>
+            <w:shd w:fill="FFFFFF" w:val="clear"/>
+            <w:tcMar>
+              <w:top w:type="dxa" w:w="80"/>
+              <w:left w:type="dxa" w:w="120"/>
+              <w:bottom w:type="dxa" w:w="80"/>
+              <w:right w:type="dxa" w:w="120"/>
+            </w:tcMar>
+          </w:tcPr>
+          <w:p>
+            <w:r>
+              <w:rPr>
+                <w:rFonts w:ascii="Arial" w:cs="Arial" w:eastAsia="Arial" w:hAnsi="Arial"/>
+                <w:color w:val="2C2C2C"/>
+                <w:sz w:val="20"/>
+                <w:szCs w:val="20"/>
+              </w:rPr>
+              <w:t xml:space="preserve">Complaint Analytics</w:t>
+            </w:r>
+          </w:p>
+        </w:tc>
+        <w:tc>
+          <w:tcPr>
+            <w:tcW w:type="dxa" w:w="4760"/>
+            <w:tcBorders>
+              <w:top w:val="single" w:color="CCCCCC" w:sz="1"/>
+              <w:left w:val="single" w:color="CCCCCC" w:sz="1"/>
+              <w:bottom w:val="single" w:color="CCCCCC" w:sz="1"/>
+              <w:right w:val="single" w:color="CCCCCC" w:sz="1"/>
+            </w:tcBorders>
+            <w:shd w:fill="FFFFFF" w:val="clear"/>
+            <w:tcMar>
+              <w:top w:type="dxa" w:w="80"/>
+              <w:left w:type="dxa" w:w="120"/>
+              <w:bottom w:type="dxa" w:w="80"/>
+              <w:right w:type="dxa" w:w="120"/>
+            </w:tcMar>
+          </w:tcPr>
+          <w:p>
+            <w:r>
+              <w:rPr>
+                <w:rFonts w:ascii="Arial" w:cs="Arial" w:eastAsia="Arial" w:hAnsi="Arial"/>
+                <w:color w:val="2C2C2C"/>
+                <w:sz w:val="20"/>
+                <w:szCs w:val="20"/>
+              </w:rPr>
+              <w:t xml:space="preserve">The dashboard shall show complaint volume by category, average resolution time, and trend over the past 30/90 days.</w:t>
+            </w:r>
+          </w:p>
+        </w:tc>
+        <w:tc>
+          <w:tcPr>
+            <w:tcW w:type="dxa" w:w="1600"/>
+            <w:tcBorders>
+              <w:top w:val="single" w:color="CCCCCC" w:sz="1"/>
+              <w:left w:val="single" w:color="CCCCCC" w:sz="1"/>
+              <w:bottom w:val="single" w:color="CCCCCC" w:sz="1"/>
+              <w:right w:val="single" w:color="CCCCCC" w:sz="1"/>
+            </w:tcBorders>
+            <w:shd w:fill="FFFFFF" w:val="clear"/>
+            <w:tcMar>
+              <w:top w:type="dxa" w:w="80"/>
+              <w:left w:type="dxa" w:w="120"/>
+              <w:bottom w:type="dxa" w:w="80"/>
+              <w:right w:type="dxa" w:w="120"/>
+            </w:tcMar>
+          </w:tcPr>
+          <w:p>
+            <w:r>
+              <w:rPr>
+                <w:rFonts w:ascii="Arial" w:cs="Arial" w:eastAsia="Arial" w:hAnsi="Arial"/>
+                <w:color w:val="2C2C2C"/>
+                <w:sz w:val="20"/>
+                <w:szCs w:val="20"/>
+              </w:rPr>
+              <w:t xml:space="preserve">Medium</w:t>
+            </w:r>
+          </w:p>
+        </w:tc>
+      </w:tr>
+      <w:tr>
+        <w:tc>
+          <w:tcPr>
+            <w:tcW w:type="dxa" w:w="600"/>
+            <w:tcBorders>
+              <w:top w:val="single" w:color="CCCCCC" w:sz="1"/>
+              <w:left w:val="single" w:color="CCCCCC" w:sz="1"/>
+              <w:bottom w:val="single" w:color="CCCCCC" w:sz="1"/>
+              <w:right w:val="single" w:color="CCCCCC" w:sz="1"/>
+            </w:tcBorders>
+            <w:shd w:fill="F2F2F2" w:val="clear"/>
+            <w:tcMar>
+              <w:top w:type="dxa" w:w="80"/>
+              <w:left w:type="dxa" w:w="120"/>
+              <w:bottom w:type="dxa" w:w="80"/>
+              <w:right w:type="dxa" w:w="120"/>
+            </w:tcMar>
+          </w:tcPr>
+          <w:p>
+            <w:r>
+              <w:rPr>
+                <w:rFonts w:ascii="Arial" w:cs="Arial" w:eastAsia="Arial" w:hAnsi="Arial"/>
+                <w:color w:val="2C2C2C"/>
+                <w:sz w:val="20"/>
+                <w:szCs w:val="20"/>
+              </w:rPr>
+              <w:t xml:space="preserve">FR-39</w:t>
+            </w:r>
+          </w:p>
+        </w:tc>
+        <w:tc>
+          <w:tcPr>
+            <w:tcW w:type="dxa" w:w="2400"/>
+            <w:tcBorders>
+              <w:top w:val="single" w:color="CCCCCC" w:sz="1"/>
+              <w:left w:val="single" w:color="CCCCCC" w:sz="1"/>
+              <w:bottom w:val="single" w:color="CCCCCC" w:sz="1"/>
+              <w:right w:val="single" w:color="CCCCCC" w:sz="1"/>
+            </w:tcBorders>
+            <w:shd w:fill="F2F2F2" w:val="clear"/>
+            <w:tcMar>
+              <w:top w:type="dxa" w:w="80"/>
+              <w:left w:type="dxa" w:w="120"/>
+              <w:bottom w:type="dxa" w:w="80"/>
+              <w:right w:type="dxa" w:w="120"/>
+            </w:tcMar>
+          </w:tcPr>
+          <w:p>
+            <w:r>
+              <w:rPr>
+                <w:rFonts w:ascii="Arial" w:cs="Arial" w:eastAsia="Arial" w:hAnsi="Arial"/>
+                <w:color w:val="2C2C2C"/>
+                <w:sz w:val="20"/>
+                <w:szCs w:val="20"/>
+              </w:rPr>
+              <w:t xml:space="preserve">Visitor Analytics</w:t>
+            </w:r>
+          </w:p>
+        </w:tc>
+        <w:tc>
+          <w:tcPr>
+            <w:tcW w:type="dxa" w:w="4760"/>
+            <w:tcBorders>
+              <w:top w:val="single" w:color="CCCCCC" w:sz="1"/>
+              <w:left w:val="single" w:color="CCCCCC" w:sz="1"/>
+              <w:bottom w:val="single" w:color="CCCCCC" w:sz="1"/>
+              <w:right w:val="single" w:color="CCCCCC" w:sz="1"/>
+            </w:tcBorders>
+            <w:shd w:fill="F2F2F2" w:val="clear"/>
+            <w:tcMar>
+              <w:top w:type="dxa" w:w="80"/>
+              <w:left w:type="dxa" w:w="120"/>
+              <w:bottom w:type="dxa" w:w="80"/>
+              <w:right w:type="dxa" w:w="120"/>
+            </w:tcMar>
+          </w:tcPr>
+          <w:p>
+            <w:r>
+              <w:rPr>
+                <w:rFonts w:ascii="Arial" w:cs="Arial" w:eastAsia="Arial" w:hAnsi="Arial"/>
+                <w:color w:val="2C2C2C"/>
+                <w:sz w:val="20"/>
+                <w:szCs w:val="20"/>
+              </w:rPr>
+              <w:t xml:space="preserve">The dashboard shall display daily visitor count trends and peak hours.</w:t>
+            </w:r>
+          </w:p>
+        </w:tc>
+        <w:tc>
+          <w:tcPr>
+            <w:tcW w:type="dxa" w:w="1600"/>
+            <w:tcBorders>
+              <w:top w:val="single" w:color="CCCCCC" w:sz="1"/>
+              <w:left w:val="single" w:color="CCCCCC" w:sz="1"/>
+              <w:bottom w:val="single" w:color="CCCCCC" w:sz="1"/>
+              <w:right w:val="single" w:color="CCCCCC" w:sz="1"/>
+            </w:tcBorders>
+            <w:shd w:fill="F2F2F2" w:val="clear"/>
+            <w:tcMar>
+              <w:top w:type="dxa" w:w="80"/>
+              <w:left w:type="dxa" w:w="120"/>
+              <w:bottom w:type="dxa" w:w="80"/>
+              <w:right w:type="dxa" w:w="120"/>
+            </w:tcMar>
+          </w:tcPr>
+          <w:p>
+            <w:r>
+              <w:rPr>
+                <w:rFonts w:ascii="Arial" w:cs="Arial" w:eastAsia="Arial" w:hAnsi="Arial"/>
+                <w:color w:val="2C2C2C"/>
+                <w:sz w:val="20"/>
+                <w:szCs w:val="20"/>
+              </w:rPr>
+              <w:t xml:space="preserve">Low</w:t>
+            </w:r>
+          </w:p>
+        </w:tc>
+      </w:tr>
+      <w:tr>
+        <w:tc>
+          <w:tcPr>
+            <w:tcW w:type="dxa" w:w="600"/>
+            <w:tcBorders>
+              <w:top w:val="single" w:color="CCCCCC" w:sz="1"/>
+              <w:left w:val="single" w:color="CCCCCC" w:sz="1"/>
+              <w:bottom w:val="single" w:color="CCCCCC" w:sz="1"/>
+              <w:right w:val="single" w:color="CCCCCC" w:sz="1"/>
+            </w:tcBorders>
+            <w:shd w:fill="FFFFFF" w:val="clear"/>
+            <w:tcMar>
+              <w:top w:type="dxa" w:w="80"/>
+              <w:left w:type="dxa" w:w="120"/>
+              <w:bottom w:type="dxa" w:w="80"/>
+              <w:right w:type="dxa" w:w="120"/>
+            </w:tcMar>
+          </w:tcPr>
+          <w:p>
+            <w:r>
+              <w:rPr>
+                <w:rFonts w:ascii="Arial" w:cs="Arial" w:eastAsia="Arial" w:hAnsi="Arial"/>
+                <w:color w:val="2C2C2C"/>
+                <w:sz w:val="20"/>
+                <w:szCs w:val="20"/>
+              </w:rPr>
+              <w:t xml:space="preserve">FR-40</w:t>
+            </w:r>
+          </w:p>
+        </w:tc>
+        <w:tc>
+          <w:tcPr>
+            <w:tcW w:type="dxa" w:w="2400"/>
+            <w:tcBorders>
+              <w:top w:val="single" w:color="CCCCCC" w:sz="1"/>
+              <w:left w:val="single" w:color="CCCCCC" w:sz="1"/>
+              <w:bottom w:val="single" w:color="CCCCCC" w:sz="1"/>
+              <w:right w:val="single" w:color="CCCCCC" w:sz="1"/>
+            </w:tcBorders>
+            <w:shd w:fill="FFFFFF" w:val="clear"/>
+            <w:tcMar>
+              <w:top w:type="dxa" w:w="80"/>
+              <w:left w:type="dxa" w:w="120"/>
+              <w:bottom w:type="dxa" w:w="80"/>
+              <w:right w:type="dxa" w:w="120"/>
+            </w:tcMar>
+          </w:tcPr>
+          <w:p>
+            <w:r>
+              <w:rPr>
+                <w:rFonts w:ascii="Arial" w:cs="Arial" w:eastAsia="Arial" w:hAnsi="Arial"/>
+                <w:color w:val="2C2C2C"/>
+                <w:sz w:val="20"/>
+                <w:szCs w:val="20"/>
+              </w:rPr>
+              <w:t xml:space="preserve">Exportable Reports</w:t>
+            </w:r>
+          </w:p>
+        </w:tc>
+        <w:tc>
+          <w:tcPr>
+            <w:tcW w:type="dxa" w:w="4760"/>
+            <w:tcBorders>
+              <w:top w:val="single" w:color="CCCCCC" w:sz="1"/>
+              <w:left w:val="single" w:color="CCCCCC" w:sz="1"/>
+              <w:bottom w:val="single" w:color="CCCCCC" w:sz="1"/>
+              <w:right w:val="single" w:color="CCCCCC" w:sz="1"/>
+            </w:tcBorders>
+            <w:shd w:fill="FFFFFF" w:val="clear"/>
+            <w:tcMar>
+              <w:top w:type="dxa" w:w="80"/>
+              <w:left w:type="dxa" w:w="120"/>
+              <w:bottom w:type="dxa" w:w="80"/>
+              <w:right w:type="dxa" w:w="120"/>
+            </w:tcMar>
+          </w:tcPr>
+          <w:p>
+            <w:r>
+              <w:rPr>
+                <w:rFonts w:ascii="Arial" w:cs="Arial" w:eastAsia="Arial" w:hAnsi="Arial"/>
+                <w:color w:val="2C2C2C"/>
+                <w:sz w:val="20"/>
+                <w:szCs w:val="20"/>
+              </w:rPr>
+              <w:t xml:space="preserve">Administrators shall be able to export any report as a CSV or PDF file.</w:t>
+            </w:r>
+          </w:p>
+        </w:tc>
+        <w:tc>
+          <w:tcPr>
+            <w:tcW w:type="dxa" w:w="1600"/>
+            <w:tcBorders>
+              <w:top w:val="single" w:color="CCCCCC" w:sz="1"/>
+              <w:left w:val="single" w:color="CCCCCC" w:sz="1"/>
+              <w:bottom w:val="single" w:color="CCCCCC" w:sz="1"/>
+              <w:right w:val="single" w:color="CCCCCC" w:sz="1"/>
+            </w:tcBorders>
+            <w:shd w:fill="FFFFFF" w:val="clear"/>
+            <w:tcMar>
+              <w:top w:type="dxa" w:w="80"/>
+              <w:left w:type="dxa" w:w="120"/>
+              <w:bottom w:type="dxa" w:w="80"/>
+              <w:right w:type="dxa" w:w="120"/>
+            </w:tcMar>
+          </w:tcPr>
+          <w:p>
+            <w:r>
+              <w:rPr>
+                <w:rFonts w:ascii="Arial" w:cs="Arial" w:eastAsia="Arial" w:hAnsi="Arial"/>
+                <w:color w:val="2C2C2C"/>
+                <w:sz w:val="20"/>
+                <w:szCs w:val="20"/>
+              </w:rPr>
+              <w:t xml:space="preserve">Medium</w:t>
+            </w:r>
+          </w:p>
+        </w:tc>
+      </w:tr>
+      <w:tr>
+        <w:tc>
+          <w:tcPr>
+            <w:tcW w:type="dxa" w:w="600"/>
+            <w:tcBorders>
+              <w:top w:val="single" w:color="CCCCCC" w:sz="1"/>
+              <w:left w:val="single" w:color="CCCCCC" w:sz="1"/>
+              <w:bottom w:val="single" w:color="CCCCCC" w:sz="1"/>
+              <w:right w:val="single" w:color="CCCCCC" w:sz="1"/>
+            </w:tcBorders>
+            <w:shd w:fill="F2F2F2" w:val="clear"/>
+            <w:tcMar>
+              <w:top w:type="dxa" w:w="80"/>
+              <w:left w:type="dxa" w:w="120"/>
+              <w:bottom w:type="dxa" w:w="80"/>
+              <w:right w:type="dxa" w:w="120"/>
+            </w:tcMar>
+          </w:tcPr>
+          <w:p>
+            <w:r>
+              <w:rPr>
+                <w:rFonts w:ascii="Arial" w:cs="Arial" w:eastAsia="Arial" w:hAnsi="Arial"/>
+                <w:color w:val="2C2C2C"/>
+                <w:sz w:val="20"/>
+                <w:szCs w:val="20"/>
+              </w:rPr>
               <w:t xml:space="preserve">FR-41</w:t>
             </w:r>
           </w:p>
@@ -8303,6 +9244,665 @@
                 <w:szCs w:val="20"/>
               </w:rPr>
               <w:t xml:space="preserve">Medium</w:t>
+            </w:r>
+          </w:p>
+        </w:tc>
+      </w:tr>
+    </w:tbl>
+    <w:p>
+      <w:pPr>
+        <w:pStyle w:val="Heading2"/>
+        <w:spacing w:after="120" w:before="280"/>
+      </w:pPr>
+      <w:r>
+        <w:rPr>
+          <w:rFonts w:ascii="Arial" w:cs="Arial" w:eastAsia="Arial" w:hAnsi="Arial"/>
+          <w:b/>
+          <w:bCs/>
+          <w:color w:val="2E75B6"/>
+          <w:sz w:val="26"/>
+          <w:szCs w:val="26"/>
+        </w:rPr>
+        <w:t xml:space="preserve">3.9 Announcements and Notice Board</w:t>
+      </w:r>
+    </w:p>
+    <w:p>
+      <w:pPr>
+        <w:spacing w:after="100" w:before="80"/>
+      </w:pPr>
+      <w:r>
+        <w:rPr>
+          <w:rFonts w:ascii="Arial" w:cs="Arial" w:eastAsia="Arial" w:hAnsi="Arial"/>
+          <w:color w:val="2C2C2C"/>
+          <w:sz w:val="22"/>
+          <w:szCs w:val="22"/>
+        </w:rPr>
+        <w:t xml:space="preserve">The system must provide a centralized channel for administrators to broadcast hostel-wide or targeted notices to residents.</w:t>
+      </w:r>
+    </w:p>
+    <w:p>
+      <w:pPr>
+        <w:spacing w:after="0" w:before="0"/>
+      </w:pPr>
+      <w:r>
+        <w:t xml:space="preserve"/>
+      </w:r>
+    </w:p>
+    <w:tbl>
+      <w:tblPr>
+        <w:tblW w:type="dxa" w:w="9360"/>
+        <w:tblBorders>
+          <w:top w:val="single" w:color="auto" w:sz="4"/>
+          <w:left w:val="single" w:color="auto" w:sz="4"/>
+          <w:bottom w:val="single" w:color="auto" w:sz="4"/>
+          <w:right w:val="single" w:color="auto" w:sz="4"/>
+          <w:insideH w:val="single" w:color="auto" w:sz="4"/>
+          <w:insideV w:val="single" w:color="auto" w:sz="4"/>
+        </w:tblBorders>
+      </w:tblPr>
+      <w:tblGrid>
+        <w:gridCol w:w="600"/>
+        <w:gridCol w:w="2400"/>
+        <w:gridCol w:w="4760"/>
+        <w:gridCol w:w="1600"/>
+      </w:tblGrid>
+      <w:tr>
+        <w:trPr>
+          <w:tblHeader/>
+        </w:trPr>
+        <w:tc>
+          <w:tcPr>
+            <w:tcW w:type="dxa" w:w="600"/>
+            <w:tcBorders>
+              <w:top w:val="single" w:color="CCCCCC" w:sz="1"/>
+              <w:left w:val="single" w:color="CCCCCC" w:sz="1"/>
+              <w:bottom w:val="single" w:color="CCCCCC" w:sz="1"/>
+              <w:right w:val="single" w:color="CCCCCC" w:sz="1"/>
+            </w:tcBorders>
+            <w:shd w:fill="1F4E79" w:val="clear"/>
+            <w:tcMar>
+              <w:top w:type="dxa" w:w="80"/>
+              <w:left w:type="dxa" w:w="120"/>
+              <w:bottom w:type="dxa" w:w="80"/>
+              <w:right w:type="dxa" w:w="120"/>
+            </w:tcMar>
+          </w:tcPr>
+          <w:p>
+            <w:r>
+              <w:rPr>
+                <w:rFonts w:ascii="Arial" w:cs="Arial" w:eastAsia="Arial" w:hAnsi="Arial"/>
+                <w:b/>
+                <w:bCs/>
+                <w:color w:val="FFFFFF"/>
+                <w:sz w:val="20"/>
+                <w:szCs w:val="20"/>
+              </w:rPr>
+              <w:t xml:space="preserve">REQ ID</w:t>
+            </w:r>
+          </w:p>
+        </w:tc>
+        <w:tc>
+          <w:tcPr>
+            <w:tcW w:type="dxa" w:w="2400"/>
+            <w:tcBorders>
+              <w:top w:val="single" w:color="CCCCCC" w:sz="1"/>
+              <w:left w:val="single" w:color="CCCCCC" w:sz="1"/>
+              <w:bottom w:val="single" w:color="CCCCCC" w:sz="1"/>
+              <w:right w:val="single" w:color="CCCCCC" w:sz="1"/>
+            </w:tcBorders>
+            <w:shd w:fill="1F4E79" w:val="clear"/>
+            <w:tcMar>
+              <w:top w:type="dxa" w:w="80"/>
+              <w:left w:type="dxa" w:w="120"/>
+              <w:bottom w:type="dxa" w:w="80"/>
+              <w:right w:type="dxa" w:w="120"/>
+            </w:tcMar>
+          </w:tcPr>
+          <w:p>
+            <w:r>
+              <w:rPr>
+                <w:rFonts w:ascii="Arial" w:cs="Arial" w:eastAsia="Arial" w:hAnsi="Arial"/>
+                <w:b/>
+                <w:bCs/>
+                <w:color w:val="FFFFFF"/>
+                <w:sz w:val="20"/>
+                <w:szCs w:val="20"/>
+              </w:rPr>
+              <w:t xml:space="preserve">Requirement Name</w:t>
+            </w:r>
+          </w:p>
+        </w:tc>
+        <w:tc>
+          <w:tcPr>
+            <w:tcW w:type="dxa" w:w="4760"/>
+            <w:tcBorders>
+              <w:top w:val="single" w:color="CCCCCC" w:sz="1"/>
+              <w:left w:val="single" w:color="CCCCCC" w:sz="1"/>
+              <w:bottom w:val="single" w:color="CCCCCC" w:sz="1"/>
+              <w:right w:val="single" w:color="CCCCCC" w:sz="1"/>
+            </w:tcBorders>
+            <w:shd w:fill="1F4E79" w:val="clear"/>
+            <w:tcMar>
+              <w:top w:type="dxa" w:w="80"/>
+              <w:left w:type="dxa" w:w="120"/>
+              <w:bottom w:type="dxa" w:w="80"/>
+              <w:right w:type="dxa" w:w="120"/>
+            </w:tcMar>
+          </w:tcPr>
+          <w:p>
+            <w:r>
+              <w:rPr>
+                <w:rFonts w:ascii="Arial" w:cs="Arial" w:eastAsia="Arial" w:hAnsi="Arial"/>
+                <w:b/>
+                <w:bCs/>
+                <w:color w:val="FFFFFF"/>
+                <w:sz w:val="20"/>
+                <w:szCs w:val="20"/>
+              </w:rPr>
+              <w:t xml:space="preserve">Description</w:t>
+            </w:r>
+          </w:p>
+        </w:tc>
+        <w:tc>
+          <w:tcPr>
+            <w:tcW w:type="dxa" w:w="1600"/>
+            <w:tcBorders>
+              <w:top w:val="single" w:color="CCCCCC" w:sz="1"/>
+              <w:left w:val="single" w:color="CCCCCC" w:sz="1"/>
+              <w:bottom w:val="single" w:color="CCCCCC" w:sz="1"/>
+              <w:right w:val="single" w:color="CCCCCC" w:sz="1"/>
+            </w:tcBorders>
+            <w:shd w:fill="1F4E79" w:val="clear"/>
+            <w:tcMar>
+              <w:top w:type="dxa" w:w="80"/>
+              <w:left w:type="dxa" w:w="120"/>
+              <w:bottom w:type="dxa" w:w="80"/>
+              <w:right w:type="dxa" w:w="120"/>
+            </w:tcMar>
+          </w:tcPr>
+          <w:p>
+            <w:r>
+              <w:rPr>
+                <w:rFonts w:ascii="Arial" w:cs="Arial" w:eastAsia="Arial" w:hAnsi="Arial"/>
+                <w:b/>
+                <w:bCs/>
+                <w:color w:val="FFFFFF"/>
+                <w:sz w:val="20"/>
+                <w:szCs w:val="20"/>
+              </w:rPr>
+              <w:t xml:space="preserve">Priority</w:t>
+            </w:r>
+          </w:p>
+        </w:tc>
+      </w:tr>
+      <w:tr>
+        <w:tc>
+          <w:tcPr>
+            <w:tcW w:type="dxa" w:w="600"/>
+            <w:tcBorders>
+              <w:top w:val="single" w:color="CCCCCC" w:sz="1"/>
+              <w:left w:val="single" w:color="CCCCCC" w:sz="1"/>
+              <w:bottom w:val="single" w:color="CCCCCC" w:sz="1"/>
+              <w:right w:val="single" w:color="CCCCCC" w:sz="1"/>
+            </w:tcBorders>
+            <w:shd w:fill="FFFFFF" w:val="clear"/>
+            <w:tcMar>
+              <w:top w:type="dxa" w:w="80"/>
+              <w:left w:type="dxa" w:w="120"/>
+              <w:bottom w:type="dxa" w:w="80"/>
+              <w:right w:type="dxa" w:w="120"/>
+            </w:tcMar>
+          </w:tcPr>
+          <w:p>
+            <w:r>
+              <w:rPr>
+                <w:rFonts w:ascii="Arial" w:cs="Arial" w:eastAsia="Arial" w:hAnsi="Arial"/>
+                <w:color w:val="2C2C2C"/>
+                <w:sz w:val="20"/>
+                <w:szCs w:val="20"/>
+              </w:rPr>
+              <w:t xml:space="preserve">FR-48</w:t>
+            </w:r>
+          </w:p>
+        </w:tc>
+        <w:tc>
+          <w:tcPr>
+            <w:tcW w:type="dxa" w:w="2400"/>
+            <w:tcBorders>
+              <w:top w:val="single" w:color="CCCCCC" w:sz="1"/>
+              <w:left w:val="single" w:color="CCCCCC" w:sz="1"/>
+              <w:bottom w:val="single" w:color="CCCCCC" w:sz="1"/>
+              <w:right w:val="single" w:color="CCCCCC" w:sz="1"/>
+            </w:tcBorders>
+            <w:shd w:fill="FFFFFF" w:val="clear"/>
+            <w:tcMar>
+              <w:top w:type="dxa" w:w="80"/>
+              <w:left w:type="dxa" w:w="120"/>
+              <w:bottom w:type="dxa" w:w="80"/>
+              <w:right w:type="dxa" w:w="120"/>
+            </w:tcMar>
+          </w:tcPr>
+          <w:p>
+            <w:r>
+              <w:rPr>
+                <w:rFonts w:ascii="Arial" w:cs="Arial" w:eastAsia="Arial" w:hAnsi="Arial"/>
+                <w:color w:val="2C2C2C"/>
+                <w:sz w:val="20"/>
+                <w:szCs w:val="20"/>
+              </w:rPr>
+              <w:t xml:space="preserve">Create Announcement</w:t>
+            </w:r>
+          </w:p>
+        </w:tc>
+        <w:tc>
+          <w:tcPr>
+            <w:tcW w:type="dxa" w:w="4760"/>
+            <w:tcBorders>
+              <w:top w:val="single" w:color="CCCCCC" w:sz="1"/>
+              <w:left w:val="single" w:color="CCCCCC" w:sz="1"/>
+              <w:bottom w:val="single" w:color="CCCCCC" w:sz="1"/>
+              <w:right w:val="single" w:color="CCCCCC" w:sz="1"/>
+            </w:tcBorders>
+            <w:shd w:fill="FFFFFF" w:val="clear"/>
+            <w:tcMar>
+              <w:top w:type="dxa" w:w="80"/>
+              <w:left w:type="dxa" w:w="120"/>
+              <w:bottom w:type="dxa" w:w="80"/>
+              <w:right w:type="dxa" w:w="120"/>
+            </w:tcMar>
+          </w:tcPr>
+          <w:p>
+            <w:r>
+              <w:rPr>
+                <w:rFonts w:ascii="Arial" w:cs="Arial" w:eastAsia="Arial" w:hAnsi="Arial"/>
+                <w:color w:val="2C2C2C"/>
+                <w:sz w:val="20"/>
+                <w:szCs w:val="20"/>
+              </w:rPr>
+              <w:t xml:space="preserve">Administrators shall be able to create announcements with a title, message body, priority level (normal/urgent), and target audience (all, specific block, or gender-specific).</w:t>
+            </w:r>
+          </w:p>
+        </w:tc>
+        <w:tc>
+          <w:tcPr>
+            <w:tcW w:type="dxa" w:w="1600"/>
+            <w:tcBorders>
+              <w:top w:val="single" w:color="CCCCCC" w:sz="1"/>
+              <w:left w:val="single" w:color="CCCCCC" w:sz="1"/>
+              <w:bottom w:val="single" w:color="CCCCCC" w:sz="1"/>
+              <w:right w:val="single" w:color="CCCCCC" w:sz="1"/>
+            </w:tcBorders>
+            <w:shd w:fill="FFFFFF" w:val="clear"/>
+            <w:tcMar>
+              <w:top w:type="dxa" w:w="80"/>
+              <w:left w:type="dxa" w:w="120"/>
+              <w:bottom w:type="dxa" w:w="80"/>
+              <w:right w:type="dxa" w:w="120"/>
+            </w:tcMar>
+          </w:tcPr>
+          <w:p>
+            <w:r>
+              <w:rPr>
+                <w:rFonts w:ascii="Arial" w:cs="Arial" w:eastAsia="Arial" w:hAnsi="Arial"/>
+                <w:color w:val="2C2C2C"/>
+                <w:sz w:val="20"/>
+                <w:szCs w:val="20"/>
+              </w:rPr>
+              <w:t xml:space="preserve">Medium</w:t>
+            </w:r>
+          </w:p>
+        </w:tc>
+      </w:tr>
+      <w:tr>
+        <w:tc>
+          <w:tcPr>
+            <w:tcW w:type="dxa" w:w="600"/>
+            <w:tcBorders>
+              <w:top w:val="single" w:color="CCCCCC" w:sz="1"/>
+              <w:left w:val="single" w:color="CCCCCC" w:sz="1"/>
+              <w:bottom w:val="single" w:color="CCCCCC" w:sz="1"/>
+              <w:right w:val="single" w:color="CCCCCC" w:sz="1"/>
+            </w:tcBorders>
+            <w:shd w:fill="F2F2F2" w:val="clear"/>
+            <w:tcMar>
+              <w:top w:type="dxa" w:w="80"/>
+              <w:left w:type="dxa" w:w="120"/>
+              <w:bottom w:type="dxa" w:w="80"/>
+              <w:right w:type="dxa" w:w="120"/>
+            </w:tcMar>
+          </w:tcPr>
+          <w:p>
+            <w:r>
+              <w:rPr>
+                <w:rFonts w:ascii="Arial" w:cs="Arial" w:eastAsia="Arial" w:hAnsi="Arial"/>
+                <w:color w:val="2C2C2C"/>
+                <w:sz w:val="20"/>
+                <w:szCs w:val="20"/>
+              </w:rPr>
+              <w:t xml:space="preserve">FR-49</w:t>
+            </w:r>
+          </w:p>
+        </w:tc>
+        <w:tc>
+          <w:tcPr>
+            <w:tcW w:type="dxa" w:w="2400"/>
+            <w:tcBorders>
+              <w:top w:val="single" w:color="CCCCCC" w:sz="1"/>
+              <w:left w:val="single" w:color="CCCCCC" w:sz="1"/>
+              <w:bottom w:val="single" w:color="CCCCCC" w:sz="1"/>
+              <w:right w:val="single" w:color="CCCCCC" w:sz="1"/>
+            </w:tcBorders>
+            <w:shd w:fill="F2F2F2" w:val="clear"/>
+            <w:tcMar>
+              <w:top w:type="dxa" w:w="80"/>
+              <w:left w:type="dxa" w:w="120"/>
+              <w:bottom w:type="dxa" w:w="80"/>
+              <w:right w:type="dxa" w:w="120"/>
+            </w:tcMar>
+          </w:tcPr>
+          <w:p>
+            <w:r>
+              <w:rPr>
+                <w:rFonts w:ascii="Arial" w:cs="Arial" w:eastAsia="Arial" w:hAnsi="Arial"/>
+                <w:color w:val="2C2C2C"/>
+                <w:sz w:val="20"/>
+                <w:szCs w:val="20"/>
+              </w:rPr>
+              <w:t xml:space="preserve">Announcement Visibility</w:t>
+            </w:r>
+          </w:p>
+        </w:tc>
+        <w:tc>
+          <w:tcPr>
+            <w:tcW w:type="dxa" w:w="4760"/>
+            <w:tcBorders>
+              <w:top w:val="single" w:color="CCCCCC" w:sz="1"/>
+              <w:left w:val="single" w:color="CCCCCC" w:sz="1"/>
+              <w:bottom w:val="single" w:color="CCCCCC" w:sz="1"/>
+              <w:right w:val="single" w:color="CCCCCC" w:sz="1"/>
+            </w:tcBorders>
+            <w:shd w:fill="F2F2F2" w:val="clear"/>
+            <w:tcMar>
+              <w:top w:type="dxa" w:w="80"/>
+              <w:left w:type="dxa" w:w="120"/>
+              <w:bottom w:type="dxa" w:w="80"/>
+              <w:right w:type="dxa" w:w="120"/>
+            </w:tcMar>
+          </w:tcPr>
+          <w:p>
+            <w:r>
+              <w:rPr>
+                <w:rFonts w:ascii="Arial" w:cs="Arial" w:eastAsia="Arial" w:hAnsi="Arial"/>
+                <w:color w:val="2C2C2C"/>
+                <w:sz w:val="20"/>
+                <w:szCs w:val="20"/>
+              </w:rPr>
+              <w:t xml:space="preserve">Published announcements shall be visible to all targeted students on their notification/dashboard view, sorted by priority and recency.</w:t>
+            </w:r>
+          </w:p>
+        </w:tc>
+        <w:tc>
+          <w:tcPr>
+            <w:tcW w:type="dxa" w:w="1600"/>
+            <w:tcBorders>
+              <w:top w:val="single" w:color="CCCCCC" w:sz="1"/>
+              <w:left w:val="single" w:color="CCCCCC" w:sz="1"/>
+              <w:bottom w:val="single" w:color="CCCCCC" w:sz="1"/>
+              <w:right w:val="single" w:color="CCCCCC" w:sz="1"/>
+            </w:tcBorders>
+            <w:shd w:fill="F2F2F2" w:val="clear"/>
+            <w:tcMar>
+              <w:top w:type="dxa" w:w="80"/>
+              <w:left w:type="dxa" w:w="120"/>
+              <w:bottom w:type="dxa" w:w="80"/>
+              <w:right w:type="dxa" w:w="120"/>
+            </w:tcMar>
+          </w:tcPr>
+          <w:p>
+            <w:r>
+              <w:rPr>
+                <w:rFonts w:ascii="Arial" w:cs="Arial" w:eastAsia="Arial" w:hAnsi="Arial"/>
+                <w:color w:val="2C2C2C"/>
+                <w:sz w:val="20"/>
+                <w:szCs w:val="20"/>
+              </w:rPr>
+              <w:t xml:space="preserve">Medium</w:t>
+            </w:r>
+          </w:p>
+        </w:tc>
+      </w:tr>
+      <w:tr>
+        <w:tc>
+          <w:tcPr>
+            <w:tcW w:type="dxa" w:w="600"/>
+            <w:tcBorders>
+              <w:top w:val="single" w:color="CCCCCC" w:sz="1"/>
+              <w:left w:val="single" w:color="CCCCCC" w:sz="1"/>
+              <w:bottom w:val="single" w:color="CCCCCC" w:sz="1"/>
+              <w:right w:val="single" w:color="CCCCCC" w:sz="1"/>
+            </w:tcBorders>
+            <w:shd w:fill="FFFFFF" w:val="clear"/>
+            <w:tcMar>
+              <w:top w:type="dxa" w:w="80"/>
+              <w:left w:type="dxa" w:w="120"/>
+              <w:bottom w:type="dxa" w:w="80"/>
+              <w:right w:type="dxa" w:w="120"/>
+            </w:tcMar>
+          </w:tcPr>
+          <w:p>
+            <w:r>
+              <w:rPr>
+                <w:rFonts w:ascii="Arial" w:cs="Arial" w:eastAsia="Arial" w:hAnsi="Arial"/>
+                <w:color w:val="2C2C2C"/>
+                <w:sz w:val="20"/>
+                <w:szCs w:val="20"/>
+              </w:rPr>
+              <w:t xml:space="preserve">FR-50</w:t>
+            </w:r>
+          </w:p>
+        </w:tc>
+        <w:tc>
+          <w:tcPr>
+            <w:tcW w:type="dxa" w:w="2400"/>
+            <w:tcBorders>
+              <w:top w:val="single" w:color="CCCCCC" w:sz="1"/>
+              <w:left w:val="single" w:color="CCCCCC" w:sz="1"/>
+              <w:bottom w:val="single" w:color="CCCCCC" w:sz="1"/>
+              <w:right w:val="single" w:color="CCCCCC" w:sz="1"/>
+            </w:tcBorders>
+            <w:shd w:fill="FFFFFF" w:val="clear"/>
+            <w:tcMar>
+              <w:top w:type="dxa" w:w="80"/>
+              <w:left w:type="dxa" w:w="120"/>
+              <w:bottom w:type="dxa" w:w="80"/>
+              <w:right w:type="dxa" w:w="120"/>
+            </w:tcMar>
+          </w:tcPr>
+          <w:p>
+            <w:r>
+              <w:rPr>
+                <w:rFonts w:ascii="Arial" w:cs="Arial" w:eastAsia="Arial" w:hAnsi="Arial"/>
+                <w:color w:val="2C2C2C"/>
+                <w:sz w:val="20"/>
+                <w:szCs w:val="20"/>
+              </w:rPr>
+              <w:t xml:space="preserve">Announcement Expiry</w:t>
+            </w:r>
+          </w:p>
+        </w:tc>
+        <w:tc>
+          <w:tcPr>
+            <w:tcW w:type="dxa" w:w="4760"/>
+            <w:tcBorders>
+              <w:top w:val="single" w:color="CCCCCC" w:sz="1"/>
+              <w:left w:val="single" w:color="CCCCCC" w:sz="1"/>
+              <w:bottom w:val="single" w:color="CCCCCC" w:sz="1"/>
+              <w:right w:val="single" w:color="CCCCCC" w:sz="1"/>
+            </w:tcBorders>
+            <w:shd w:fill="FFFFFF" w:val="clear"/>
+            <w:tcMar>
+              <w:top w:type="dxa" w:w="80"/>
+              <w:left w:type="dxa" w:w="120"/>
+              <w:bottom w:type="dxa" w:w="80"/>
+              <w:right w:type="dxa" w:w="120"/>
+            </w:tcMar>
+          </w:tcPr>
+          <w:p>
+            <w:r>
+              <w:rPr>
+                <w:rFonts w:ascii="Arial" w:cs="Arial" w:eastAsia="Arial" w:hAnsi="Arial"/>
+                <w:color w:val="2C2C2C"/>
+                <w:sz w:val="20"/>
+                <w:szCs w:val="20"/>
+              </w:rPr>
+              <w:t xml:space="preserve">Administrators shall be able to set an optional expiry date after which an announcement is automatically archived and no longer shown as active.</w:t>
+            </w:r>
+          </w:p>
+        </w:tc>
+        <w:tc>
+          <w:tcPr>
+            <w:tcW w:type="dxa" w:w="1600"/>
+            <w:tcBorders>
+              <w:top w:val="single" w:color="CCCCCC" w:sz="1"/>
+              <w:left w:val="single" w:color="CCCCCC" w:sz="1"/>
+              <w:bottom w:val="single" w:color="CCCCCC" w:sz="1"/>
+              <w:right w:val="single" w:color="CCCCCC" w:sz="1"/>
+            </w:tcBorders>
+            <w:shd w:fill="FFFFFF" w:val="clear"/>
+            <w:tcMar>
+              <w:top w:type="dxa" w:w="80"/>
+              <w:left w:type="dxa" w:w="120"/>
+              <w:bottom w:type="dxa" w:w="80"/>
+              <w:right w:type="dxa" w:w="120"/>
+            </w:tcMar>
+          </w:tcPr>
+          <w:p>
+            <w:r>
+              <w:rPr>
+                <w:rFonts w:ascii="Arial" w:cs="Arial" w:eastAsia="Arial" w:hAnsi="Arial"/>
+                <w:color w:val="2C2C2C"/>
+                <w:sz w:val="20"/>
+                <w:szCs w:val="20"/>
+              </w:rPr>
+              <w:t xml:space="preserve">Low</w:t>
+            </w:r>
+          </w:p>
+        </w:tc>
+      </w:tr>
+      <w:tr>
+        <w:tc>
+          <w:tcPr>
+            <w:tcW w:type="dxa" w:w="600"/>
+            <w:tcBorders>
+              <w:top w:val="single" w:color="CCCCCC" w:sz="1"/>
+              <w:left w:val="single" w:color="CCCCCC" w:sz="1"/>
+              <w:bottom w:val="single" w:color="CCCCCC" w:sz="1"/>
+              <w:right w:val="single" w:color="CCCCCC" w:sz="1"/>
+            </w:tcBorders>
+            <w:shd w:fill="F2F2F2" w:val="clear"/>
+            <w:tcMar>
+              <w:top w:type="dxa" w:w="80"/>
+              <w:left w:type="dxa" w:w="120"/>
+              <w:bottom w:type="dxa" w:w="80"/>
+              <w:right w:type="dxa" w:w="120"/>
+            </w:tcMar>
+          </w:tcPr>
+          <w:p>
+            <w:r>
+              <w:rPr>
+                <w:rFonts w:ascii="Arial" w:cs="Arial" w:eastAsia="Arial" w:hAnsi="Arial"/>
+                <w:color w:val="2C2C2C"/>
+                <w:sz w:val="20"/>
+                <w:szCs w:val="20"/>
+              </w:rPr>
+              <w:t xml:space="preserve">FR-51</w:t>
+            </w:r>
+          </w:p>
+        </w:tc>
+        <w:tc>
+          <w:tcPr>
+            <w:tcW w:type="dxa" w:w="2400"/>
+            <w:tcBorders>
+              <w:top w:val="single" w:color="CCCCCC" w:sz="1"/>
+              <w:left w:val="single" w:color="CCCCCC" w:sz="1"/>
+              <w:bottom w:val="single" w:color="CCCCCC" w:sz="1"/>
+              <w:right w:val="single" w:color="CCCCCC" w:sz="1"/>
+            </w:tcBorders>
+            <w:shd w:fill="F2F2F2" w:val="clear"/>
+            <w:tcMar>
+              <w:top w:type="dxa" w:w="80"/>
+              <w:left w:type="dxa" w:w="120"/>
+              <w:bottom w:type="dxa" w:w="80"/>
+              <w:right w:type="dxa" w:w="120"/>
+            </w:tcMar>
+          </w:tcPr>
+          <w:p>
+            <w:r>
+              <w:rPr>
+                <w:rFonts w:ascii="Arial" w:cs="Arial" w:eastAsia="Arial" w:hAnsi="Arial"/>
+                <w:color w:val="2C2C2C"/>
+                <w:sz w:val="20"/>
+                <w:szCs w:val="20"/>
+              </w:rPr>
+              <w:t xml:space="preserve">Announcement History</w:t>
+            </w:r>
+          </w:p>
+        </w:tc>
+        <w:tc>
+          <w:tcPr>
+            <w:tcW w:type="dxa" w:w="4760"/>
+            <w:tcBorders>
+              <w:top w:val="single" w:color="CCCCCC" w:sz="1"/>
+              <w:left w:val="single" w:color="CCCCCC" w:sz="1"/>
+              <w:bottom w:val="single" w:color="CCCCCC" w:sz="1"/>
+              <w:right w:val="single" w:color="CCCCCC" w:sz="1"/>
+            </w:tcBorders>
+            <w:shd w:fill="F2F2F2" w:val="clear"/>
+            <w:tcMar>
+              <w:top w:type="dxa" w:w="80"/>
+              <w:left w:type="dxa" w:w="120"/>
+              <w:bottom w:type="dxa" w:w="80"/>
+              <w:right w:type="dxa" w:w="120"/>
+            </w:tcMar>
+          </w:tcPr>
+          <w:p>
+            <w:r>
+              <w:rPr>
+                <w:rFonts w:ascii="Arial" w:cs="Arial" w:eastAsia="Arial" w:hAnsi="Arial"/>
+                <w:color w:val="2C2C2C"/>
+                <w:sz w:val="20"/>
+                <w:szCs w:val="20"/>
+              </w:rPr>
+              <w:t xml:space="preserve">All past announcements shall remain searchable in an archive view for administrators.</w:t>
+            </w:r>
+          </w:p>
+        </w:tc>
+        <w:tc>
+          <w:tcPr>
+            <w:tcW w:type="dxa" w:w="1600"/>
+            <w:tcBorders>
+              <w:top w:val="single" w:color="CCCCCC" w:sz="1"/>
+              <w:left w:val="single" w:color="CCCCCC" w:sz="1"/>
+              <w:bottom w:val="single" w:color="CCCCCC" w:sz="1"/>
+              <w:right w:val="single" w:color="CCCCCC" w:sz="1"/>
+            </w:tcBorders>
+            <w:shd w:fill="F2F2F2" w:val="clear"/>
+            <w:tcMar>
+              <w:top w:type="dxa" w:w="80"/>
+              <w:left w:type="dxa" w:w="120"/>
+              <w:bottom w:type="dxa" w:w="80"/>
+              <w:right w:type="dxa" w:w="120"/>
+            </w:tcMar>
+          </w:tcPr>
+          <w:p>
+            <w:r>
+              <w:rPr>
+                <w:rFonts w:ascii="Arial" w:cs="Arial" w:eastAsia="Arial" w:hAnsi="Arial"/>
+                <w:color w:val="2C2C2C"/>
+                <w:sz w:val="20"/>
+                <w:szCs w:val="20"/>
+              </w:rPr>
+              <w:t xml:space="preserve">Low</w:t>
             </w:r>
           </w:p>
         </w:tc>
@@ -9095,7 +10695,7 @@
                 <w:sz w:val="20"/>
                 <w:szCs w:val="20"/>
               </w:rPr>
-              <w:t xml:space="preserve">Register students, manage rooms, allocate rooms, record payments, manage fee structures, view all complaints, assign complaints, generate reports, manage user accounts, view analytics dashboard, configure system settings</w:t>
+              <w:t xml:space="preserve">Register students, manage rooms, allocate rooms, record payments, manage fee structures, manage mess menu and mess fees, publish announcements, view all complaints, assign complaints, generate reports, manage user accounts, view analytics dashboard, configure system settings</w:t>
             </w:r>
           </w:p>
         </w:tc>
@@ -9219,7 +10819,7 @@
                 <w:sz w:val="20"/>
                 <w:szCs w:val="20"/>
               </w:rPr>
-              <w:t xml:space="preserve">Log in, view profile, view room details, submit complaints, track complaint status, view fee history, view payment due dates, receive email notifications</w:t>
+              <w:t xml:space="preserve">Log in, view profile, view room details, submit complaints, track complaint status, view fee history, view payment due dates, view mess menu and mark meal attendance, view mess fee status, view announcements, receive email notifications</w:t>
             </w:r>
           </w:p>
         </w:tc>
@@ -9357,6 +10957,44 @@
           <w:szCs w:val="22"/>
         </w:rPr>
         <w:t xml:space="preserve">VisitorLog — linked to one Student (visitee), has check-in and check-out timestamps</w:t>
+      </w:r>
+    </w:p>
+    <w:p>
+      <w:pPr>
+        <w:pStyle w:val="ListParagraph"/>
+        <w:numPr>
+          <w:ilvl w:val="0"/>
+          <w:numId w:val="2"/>
+        </w:numPr>
+        <w:spacing w:after="60" w:before="60"/>
+      </w:pPr>
+      <w:r>
+        <w:rPr>
+          <w:rFonts w:ascii="Arial" w:cs="Arial" w:eastAsia="Arial" w:hAnsi="Arial"/>
+          <w:color w:val="2C2C2C"/>
+          <w:sz w:val="22"/>
+          <w:szCs w:val="22"/>
+        </w:rPr>
+        <w:t xml:space="preserve">MessRecord — belongs to one Student, tracks meal attendance and mess fee status per billing cycle</w:t>
+      </w:r>
+    </w:p>
+    <w:p>
+      <w:pPr>
+        <w:pStyle w:val="ListParagraph"/>
+        <w:numPr>
+          <w:ilvl w:val="0"/>
+          <w:numId w:val="2"/>
+        </w:numPr>
+        <w:spacing w:after="60" w:before="60"/>
+      </w:pPr>
+      <w:r>
+        <w:rPr>
+          <w:rFonts w:ascii="Arial" w:cs="Arial" w:eastAsia="Arial" w:hAnsi="Arial"/>
+          <w:color w:val="2C2C2C"/>
+          <w:sz w:val="22"/>
+          <w:szCs w:val="22"/>
+        </w:rPr>
+        <w:t xml:space="preserve">Announcement — created by one Admin (User), optionally targeted to a block or gender, has an expiry date</w:t>
       </w:r>
     </w:p>
     <w:p>
@@ -9919,6 +11557,130 @@
                 <w:szCs w:val="20"/>
               </w:rPr>
               <w:t xml:space="preserve">id, user_id (FK), message, type, is_read, created_at</w:t>
+            </w:r>
+          </w:p>
+        </w:tc>
+      </w:tr>
+      <w:tr>
+        <w:tc>
+          <w:tcPr>
+            <w:tcW w:type="dxa" w:w="2400"/>
+            <w:tcBorders>
+              <w:top w:val="single" w:color="CCCCCC" w:sz="1"/>
+              <w:left w:val="single" w:color="CCCCCC" w:sz="1"/>
+              <w:bottom w:val="single" w:color="CCCCCC" w:sz="1"/>
+              <w:right w:val="single" w:color="CCCCCC" w:sz="1"/>
+            </w:tcBorders>
+            <w:shd w:fill="D6E4F0" w:val="clear"/>
+            <w:tcMar>
+              <w:top w:type="dxa" w:w="80"/>
+              <w:left w:type="dxa" w:w="120"/>
+              <w:bottom w:type="dxa" w:w="80"/>
+              <w:right w:type="dxa" w:w="120"/>
+            </w:tcMar>
+          </w:tcPr>
+          <w:p>
+            <w:r>
+              <w:rPr>
+                <w:rFonts w:ascii="Arial" w:cs="Arial" w:eastAsia="Arial" w:hAnsi="Arial"/>
+                <w:b/>
+                <w:bCs/>
+                <w:color w:val="1F4E79"/>
+                <w:sz w:val="20"/>
+                <w:szCs w:val="20"/>
+              </w:rPr>
+              <w:t xml:space="preserve">mess_records</w:t>
+            </w:r>
+          </w:p>
+        </w:tc>
+        <w:tc>
+          <w:tcPr>
+            <w:tcW w:type="dxa" w:w="6960"/>
+            <w:tcBorders>
+              <w:top w:val="single" w:color="CCCCCC" w:sz="1"/>
+              <w:left w:val="single" w:color="CCCCCC" w:sz="1"/>
+              <w:bottom w:val="single" w:color="CCCCCC" w:sz="1"/>
+              <w:right w:val="single" w:color="CCCCCC" w:sz="1"/>
+            </w:tcBorders>
+            <w:shd w:fill="FFFFFF" w:val="clear"/>
+            <w:tcMar>
+              <w:top w:type="dxa" w:w="80"/>
+              <w:left w:type="dxa" w:w="120"/>
+              <w:bottom w:type="dxa" w:w="80"/>
+              <w:right w:type="dxa" w:w="120"/>
+            </w:tcMar>
+          </w:tcPr>
+          <w:p>
+            <w:r>
+              <w:rPr>
+                <w:rFonts w:ascii="Arial" w:cs="Arial" w:eastAsia="Arial" w:hAnsi="Arial"/>
+                <w:color w:val="2C2C2C"/>
+                <w:sz w:val="20"/>
+                <w:szCs w:val="20"/>
+              </w:rPr>
+              <w:t xml:space="preserve">id, student_id (FK), date, meal_type, attendance_marked, fee_status, created_at</w:t>
+            </w:r>
+          </w:p>
+        </w:tc>
+      </w:tr>
+      <w:tr>
+        <w:tc>
+          <w:tcPr>
+            <w:tcW w:type="dxa" w:w="2400"/>
+            <w:tcBorders>
+              <w:top w:val="single" w:color="CCCCCC" w:sz="1"/>
+              <w:left w:val="single" w:color="CCCCCC" w:sz="1"/>
+              <w:bottom w:val="single" w:color="CCCCCC" w:sz="1"/>
+              <w:right w:val="single" w:color="CCCCCC" w:sz="1"/>
+            </w:tcBorders>
+            <w:shd w:fill="D6E4F0" w:val="clear"/>
+            <w:tcMar>
+              <w:top w:type="dxa" w:w="80"/>
+              <w:left w:type="dxa" w:w="120"/>
+              <w:bottom w:type="dxa" w:w="80"/>
+              <w:right w:type="dxa" w:w="120"/>
+            </w:tcMar>
+          </w:tcPr>
+          <w:p>
+            <w:r>
+              <w:rPr>
+                <w:rFonts w:ascii="Arial" w:cs="Arial" w:eastAsia="Arial" w:hAnsi="Arial"/>
+                <w:b/>
+                <w:bCs/>
+                <w:color w:val="1F4E79"/>
+                <w:sz w:val="20"/>
+                <w:szCs w:val="20"/>
+              </w:rPr>
+              <w:t xml:space="preserve">announcements</w:t>
+            </w:r>
+          </w:p>
+        </w:tc>
+        <w:tc>
+          <w:tcPr>
+            <w:tcW w:type="dxa" w:w="6960"/>
+            <w:tcBorders>
+              <w:top w:val="single" w:color="CCCCCC" w:sz="1"/>
+              <w:left w:val="single" w:color="CCCCCC" w:sz="1"/>
+              <w:bottom w:val="single" w:color="CCCCCC" w:sz="1"/>
+              <w:right w:val="single" w:color="CCCCCC" w:sz="1"/>
+            </w:tcBorders>
+            <w:shd w:fill="F2F2F2" w:val="clear"/>
+            <w:tcMar>
+              <w:top w:type="dxa" w:w="80"/>
+              <w:left w:type="dxa" w:w="120"/>
+              <w:bottom w:type="dxa" w:w="80"/>
+              <w:right w:type="dxa" w:w="120"/>
+            </w:tcMar>
+          </w:tcPr>
+          <w:p>
+            <w:r>
+              <w:rPr>
+                <w:rFonts w:ascii="Arial" w:cs="Arial" w:eastAsia="Arial" w:hAnsi="Arial"/>
+                <w:color w:val="2C2C2C"/>
+                <w:sz w:val="20"/>
+                <w:szCs w:val="20"/>
+              </w:rPr>
+              <w:t xml:space="preserve">id, title, message, priority, target_audience, posted_by (FK), expires_at, created_at</w:t>
             </w:r>
           </w:p>
         </w:tc>
@@ -11289,6 +13051,124 @@
           </w:p>
         </w:tc>
       </w:tr>
+      <w:tr>
+        <w:tc>
+          <w:tcPr>
+            <w:tcW w:type="dxa" w:w="1200"/>
+            <w:tcBorders>
+              <w:top w:val="single" w:color="CCCCCC" w:sz="1"/>
+              <w:left w:val="single" w:color="CCCCCC" w:sz="1"/>
+              <w:bottom w:val="single" w:color="CCCCCC" w:sz="1"/>
+              <w:right w:val="single" w:color="CCCCCC" w:sz="1"/>
+            </w:tcBorders>
+            <w:shd w:fill="F2F2F2" w:val="clear"/>
+            <w:tcMar>
+              <w:top w:type="dxa" w:w="80"/>
+              <w:left w:type="dxa" w:w="120"/>
+              <w:bottom w:type="dxa" w:w="80"/>
+              <w:right w:type="dxa" w:w="120"/>
+            </w:tcMar>
+          </w:tcPr>
+          <w:p>
+            <w:r>
+              <w:rPr>
+                <w:rFonts w:ascii="Arial" w:cs="Arial" w:eastAsia="Arial" w:hAnsi="Arial"/>
+                <w:color w:val="2C2C2C"/>
+                <w:sz w:val="20"/>
+                <w:szCs w:val="20"/>
+              </w:rPr>
+              <w:t xml:space="preserve">1.1</w:t>
+            </w:r>
+          </w:p>
+        </w:tc>
+        <w:tc>
+          <w:tcPr>
+            <w:tcW w:type="dxa" w:w="1800"/>
+            <w:tcBorders>
+              <w:top w:val="single" w:color="CCCCCC" w:sz="1"/>
+              <w:left w:val="single" w:color="CCCCCC" w:sz="1"/>
+              <w:bottom w:val="single" w:color="CCCCCC" w:sz="1"/>
+              <w:right w:val="single" w:color="CCCCCC" w:sz="1"/>
+            </w:tcBorders>
+            <w:shd w:fill="F2F2F2" w:val="clear"/>
+            <w:tcMar>
+              <w:top w:type="dxa" w:w="80"/>
+              <w:left w:type="dxa" w:w="120"/>
+              <w:bottom w:type="dxa" w:w="80"/>
+              <w:right w:type="dxa" w:w="120"/>
+            </w:tcMar>
+          </w:tcPr>
+          <w:p>
+            <w:r>
+              <w:rPr>
+                <w:rFonts w:ascii="Arial" w:cs="Arial" w:eastAsia="Arial" w:hAnsi="Arial"/>
+                <w:color w:val="2C2C2C"/>
+                <w:sz w:val="20"/>
+                <w:szCs w:val="20"/>
+              </w:rPr>
+              <w:t xml:space="preserve">June 2026</w:t>
+            </w:r>
+          </w:p>
+        </w:tc>
+        <w:tc>
+          <w:tcPr>
+            <w:tcW w:type="dxa" w:w="4560"/>
+            <w:tcBorders>
+              <w:top w:val="single" w:color="CCCCCC" w:sz="1"/>
+              <w:left w:val="single" w:color="CCCCCC" w:sz="1"/>
+              <w:bottom w:val="single" w:color="CCCCCC" w:sz="1"/>
+              <w:right w:val="single" w:color="CCCCCC" w:sz="1"/>
+            </w:tcBorders>
+            <w:shd w:fill="F2F2F2" w:val="clear"/>
+            <w:tcMar>
+              <w:top w:type="dxa" w:w="80"/>
+              <w:left w:type="dxa" w:w="120"/>
+              <w:bottom w:type="dxa" w:w="80"/>
+              <w:right w:type="dxa" w:w="120"/>
+            </w:tcMar>
+          </w:tcPr>
+          <w:p>
+            <w:r>
+              <w:rPr>
+                <w:rFonts w:ascii="Arial" w:cs="Arial" w:eastAsia="Arial" w:hAnsi="Arial"/>
+                <w:color w:val="2C2C2C"/>
+                <w:sz w:val="20"/>
+                <w:szCs w:val="20"/>
+              </w:rPr>
+              <w:t xml:space="preserve">Added Mess Management (3.5, FR-42–FR-47) and Announcements/Notice Board (3.9, FR-48–FR-51) modules; updated entity relationships, database tables, and use case summaries accordingly</w:t>
+            </w:r>
+          </w:p>
+        </w:tc>
+        <w:tc>
+          <w:tcPr>
+            <w:tcW w:type="dxa" w:w="1800"/>
+            <w:tcBorders>
+              <w:top w:val="single" w:color="CCCCCC" w:sz="1"/>
+              <w:left w:val="single" w:color="CCCCCC" w:sz="1"/>
+              <w:bottom w:val="single" w:color="CCCCCC" w:sz="1"/>
+              <w:right w:val="single" w:color="CCCCCC" w:sz="1"/>
+            </w:tcBorders>
+            <w:shd w:fill="F2F2F2" w:val="clear"/>
+            <w:tcMar>
+              <w:top w:type="dxa" w:w="80"/>
+              <w:left w:type="dxa" w:w="120"/>
+              <w:bottom w:type="dxa" w:w="80"/>
+              <w:right w:type="dxa" w:w="120"/>
+            </w:tcMar>
+          </w:tcPr>
+          <w:p>
+            <w:r>
+              <w:rPr>
+                <w:rFonts w:ascii="Arial" w:cs="Arial" w:eastAsia="Arial" w:hAnsi="Arial"/>
+                <w:color w:val="2C2C2C"/>
+                <w:sz w:val="20"/>
+                <w:szCs w:val="20"/>
+              </w:rPr>
+              <w:t xml:space="preserve">Project Team</w:t>
+            </w:r>
+          </w:p>
+        </w:tc>
+      </w:tr>
     </w:tbl>
     <w:p>
       <w:pPr>
@@ -11315,7 +13195,7 @@
           <w:sz w:val="18"/>
           <w:szCs w:val="18"/>
         </w:rPr>
-        <w:t xml:space="preserve">END OF DOCUMENT — Hostel Management System SRS v1.0</w:t>
+        <w:t xml:space="preserve">END OF DOCUMENT — Hostel Management System SRS v1.1</w:t>
       </w:r>
     </w:p>
     <w:sectPr>
@@ -11497,7 +13377,7 @@
         <w:sz w:val="18"/>
         <w:szCs w:val="18"/>
       </w:rPr>
-      <w:t xml:space="preserve">Version 1.0</w:t>
+      <w:t xml:space="preserve">Version 1.1</w:t>
     </w:r>
   </w:p>
 </w:hdr>

</xml_diff>